<commit_message>
Lots of changes for TaxProgram. Moved lots of files to make upload faster.
</commit_message>
<xml_diff>
--- a/Documentation/AboutTAXTools.docx
+++ b/Documentation/AboutTAXTools.docx
@@ -1,6 +1,6 @@
 
 <file path=word/document.xml><?xml version="1.0" encoding="utf-8"?>
-<w:document xmlns:ve="http://schemas.openxmlformats.org/markup-compatibility/2006" xmlns:o="urn:schemas-microsoft-com:office:office" xmlns:r="http://schemas.openxmlformats.org/officeDocument/2006/relationships" xmlns:m="http://schemas.openxmlformats.org/officeDocument/2006/math" xmlns:v="urn:schemas-microsoft-com:vml" xmlns:wp="http://schemas.openxmlformats.org/drawingml/2006/wordprocessingDrawing" xmlns:w10="urn:schemas-microsoft-com:office:word" xmlns:w="http://schemas.openxmlformats.org/wordprocessingml/2006/main" xmlns:wne="http://schemas.microsoft.com/office/word/2006/wordml">
+<w:document xmlns:wpc="http://schemas.microsoft.com/office/word/2010/wordprocessingCanvas" xmlns:cx="http://schemas.microsoft.com/office/drawing/2014/chartex" xmlns:cx1="http://schemas.microsoft.com/office/drawing/2015/9/8/chartex" xmlns:cx2="http://schemas.microsoft.com/office/drawing/2015/10/21/chartex" xmlns:cx3="http://schemas.microsoft.com/office/drawing/2016/5/9/chartex" xmlns:cx4="http://schemas.microsoft.com/office/drawing/2016/5/10/chartex" xmlns:cx5="http://schemas.microsoft.com/office/drawing/2016/5/11/chartex" xmlns:cx6="http://schemas.microsoft.com/office/drawing/2016/5/12/chartex" xmlns:cx7="http://schemas.microsoft.com/office/drawing/2016/5/13/chartex" xmlns:cx8="http://schemas.microsoft.com/office/drawing/2016/5/14/chartex" xmlns:mc="http://schemas.openxmlformats.org/markup-compatibility/2006" xmlns:aink="http://schemas.microsoft.com/office/drawing/2016/ink" xmlns:am3d="http://schemas.microsoft.com/office/drawing/2017/model3d" xmlns:o="urn:schemas-microsoft-com:office:office" xmlns:oel="http://schemas.microsoft.com/office/2019/extlst" xmlns:r="http://schemas.openxmlformats.org/officeDocument/2006/relationships" xmlns:m="http://schemas.openxmlformats.org/officeDocument/2006/math" xmlns:v="urn:schemas-microsoft-com:vml" xmlns:wp14="http://schemas.microsoft.com/office/word/2010/wordprocessingDrawing" xmlns:wp="http://schemas.openxmlformats.org/drawingml/2006/wordprocessingDrawing" xmlns:w10="urn:schemas-microsoft-com:office:word" xmlns:w="http://schemas.openxmlformats.org/wordprocessingml/2006/main" xmlns:w14="http://schemas.microsoft.com/office/word/2010/wordml" xmlns:w15="http://schemas.microsoft.com/office/word/2012/wordml" xmlns:w16cex="http://schemas.microsoft.com/office/word/2018/wordml/cex" xmlns:w16cid="http://schemas.microsoft.com/office/word/2016/wordml/cid" xmlns:w16="http://schemas.microsoft.com/office/word/2018/wordml" xmlns:w16du="http://schemas.microsoft.com/office/word/2023/wordml/word16du" xmlns:w16sdtdh="http://schemas.microsoft.com/office/word/2020/wordml/sdtdatahash" xmlns:w16sdtfl="http://schemas.microsoft.com/office/word/2024/wordml/sdtformatlock" xmlns:w16se="http://schemas.microsoft.com/office/word/2015/wordml/symex" xmlns:wpg="http://schemas.microsoft.com/office/word/2010/wordprocessingGroup" xmlns:wpi="http://schemas.microsoft.com/office/word/2010/wordprocessingInk" xmlns:wne="http://schemas.microsoft.com/office/word/2006/wordml" xmlns:wps="http://schemas.microsoft.com/office/word/2010/wordprocessingShape" mc:Ignorable="w14 w15 w16se w16cid w16 w16cex w16sdtdh w16sdtfl w16du wp14">
   <w:body>
     <w:p>
       <w:pPr>
@@ -47,7 +47,7 @@
         <w:rPr>
           <w:noProof/>
         </w:rPr>
-        <w:t>September 1, 2026</w:t>
+        <w:t>September 2, 2026</w:t>
       </w:r>
       <w:r>
         <w:rPr>
@@ -92,6 +92,1109 @@
         <w:t>Tools</w:t>
       </w:r>
     </w:p>
+    <w:sdt>
+      <w:sdtPr>
+        <w:id w:val="-1250429959"/>
+        <w:docPartObj>
+          <w:docPartGallery w:val="Table of Contents"/>
+          <w:docPartUnique/>
+        </w:docPartObj>
+      </w:sdtPr>
+      <w:sdtEndPr>
+        <w:rPr>
+          <w:noProof/>
+        </w:rPr>
+      </w:sdtEndPr>
+      <w:sdtContent>
+        <w:p/>
+        <w:p>
+          <w:pPr>
+            <w:pStyle w:val="TOC1"/>
+            <w:rPr>
+              <w:rFonts w:asciiTheme="minorHAnsi" w:eastAsiaTheme="minorEastAsia" w:hAnsiTheme="minorHAnsi" w:cstheme="minorBidi"/>
+              <w:b w:val="0"/>
+              <w:sz w:val="22"/>
+              <w:szCs w:val="22"/>
+              <w:lang w:eastAsia="en-US"/>
+            </w:rPr>
+          </w:pPr>
+          <w:r>
+            <w:fldChar w:fldCharType="begin"/>
+          </w:r>
+          <w:r>
+            <w:instrText xml:space="preserve"> TOC \o "1-3" \h \z \u </w:instrText>
+          </w:r>
+          <w:r>
+            <w:fldChar w:fldCharType="separate"/>
+          </w:r>
+          <w:hyperlink w:anchor="_Toc239272551" w:history="1">
+            <w:r>
+              <w:rPr>
+                <w:rStyle w:val="Hyperlink"/>
+              </w:rPr>
+              <w:t>Introduction</w:t>
+            </w:r>
+            <w:r>
+              <w:rPr>
+                <w:webHidden/>
+              </w:rPr>
+              <w:tab/>
+            </w:r>
+            <w:r>
+              <w:rPr>
+                <w:webHidden/>
+              </w:rPr>
+              <w:fldChar w:fldCharType="begin"/>
+            </w:r>
+            <w:r>
+              <w:rPr>
+                <w:webHidden/>
+              </w:rPr>
+              <w:instrText xml:space="preserve"> PAGEREF _Toc239272551 \h </w:instrText>
+            </w:r>
+            <w:r>
+              <w:rPr>
+                <w:webHidden/>
+              </w:rPr>
+            </w:r>
+            <w:r>
+              <w:rPr>
+                <w:webHidden/>
+              </w:rPr>
+              <w:fldChar w:fldCharType="separate"/>
+            </w:r>
+            <w:r>
+              <w:rPr>
+                <w:webHidden/>
+              </w:rPr>
+              <w:t>1</w:t>
+            </w:r>
+            <w:r>
+              <w:rPr>
+                <w:webHidden/>
+              </w:rPr>
+              <w:fldChar w:fldCharType="end"/>
+            </w:r>
+          </w:hyperlink>
+        </w:p>
+        <w:p>
+          <w:pPr>
+            <w:pStyle w:val="TOC1"/>
+            <w:rPr>
+              <w:rFonts w:asciiTheme="minorHAnsi" w:eastAsiaTheme="minorEastAsia" w:hAnsiTheme="minorHAnsi" w:cstheme="minorBidi"/>
+              <w:b w:val="0"/>
+              <w:sz w:val="22"/>
+              <w:szCs w:val="22"/>
+              <w:lang w:eastAsia="en-US"/>
+            </w:rPr>
+          </w:pPr>
+          <w:hyperlink w:anchor="_Toc239272552" w:history="1">
+            <w:r>
+              <w:rPr>
+                <w:rStyle w:val="Hyperlink"/>
+              </w:rPr>
+              <w:t>Interface</w:t>
+            </w:r>
+            <w:r>
+              <w:rPr>
+                <w:webHidden/>
+              </w:rPr>
+              <w:tab/>
+            </w:r>
+            <w:r>
+              <w:rPr>
+                <w:webHidden/>
+              </w:rPr>
+              <w:fldChar w:fldCharType="begin"/>
+            </w:r>
+            <w:r>
+              <w:rPr>
+                <w:webHidden/>
+              </w:rPr>
+              <w:instrText xml:space="preserve"> PAGEREF _Toc239272552 \h </w:instrText>
+            </w:r>
+            <w:r>
+              <w:rPr>
+                <w:webHidden/>
+              </w:rPr>
+            </w:r>
+            <w:r>
+              <w:rPr>
+                <w:webHidden/>
+              </w:rPr>
+              <w:fldChar w:fldCharType="separate"/>
+            </w:r>
+            <w:r>
+              <w:rPr>
+                <w:webHidden/>
+              </w:rPr>
+              <w:t>2</w:t>
+            </w:r>
+            <w:r>
+              <w:rPr>
+                <w:webHidden/>
+              </w:rPr>
+              <w:fldChar w:fldCharType="end"/>
+            </w:r>
+          </w:hyperlink>
+        </w:p>
+        <w:p>
+          <w:pPr>
+            <w:pStyle w:val="TOC2"/>
+            <w:rPr>
+              <w:rFonts w:asciiTheme="minorHAnsi" w:eastAsiaTheme="minorEastAsia" w:hAnsiTheme="minorHAnsi" w:cstheme="minorBidi"/>
+              <w:noProof/>
+              <w:sz w:val="22"/>
+              <w:szCs w:val="22"/>
+              <w:lang w:eastAsia="en-US"/>
+            </w:rPr>
+          </w:pPr>
+          <w:hyperlink w:anchor="_Toc239272553" w:history="1">
+            <w:r>
+              <w:rPr>
+                <w:rStyle w:val="Hyperlink"/>
+                <w:noProof/>
+              </w:rPr>
+              <w:t>Tooltips</w:t>
+            </w:r>
+            <w:r>
+              <w:rPr>
+                <w:noProof/>
+                <w:webHidden/>
+              </w:rPr>
+              <w:tab/>
+            </w:r>
+            <w:r>
+              <w:rPr>
+                <w:noProof/>
+                <w:webHidden/>
+              </w:rPr>
+              <w:fldChar w:fldCharType="begin"/>
+            </w:r>
+            <w:r>
+              <w:rPr>
+                <w:noProof/>
+                <w:webHidden/>
+              </w:rPr>
+              <w:instrText xml:space="preserve"> PAGEREF _Toc239272553 \h </w:instrText>
+            </w:r>
+            <w:r>
+              <w:rPr>
+                <w:noProof/>
+                <w:webHidden/>
+              </w:rPr>
+            </w:r>
+            <w:r>
+              <w:rPr>
+                <w:noProof/>
+                <w:webHidden/>
+              </w:rPr>
+              <w:fldChar w:fldCharType="separate"/>
+            </w:r>
+            <w:r>
+              <w:rPr>
+                <w:noProof/>
+                <w:webHidden/>
+              </w:rPr>
+              <w:t>2</w:t>
+            </w:r>
+            <w:r>
+              <w:rPr>
+                <w:noProof/>
+                <w:webHidden/>
+              </w:rPr>
+              <w:fldChar w:fldCharType="end"/>
+            </w:r>
+          </w:hyperlink>
+        </w:p>
+        <w:p>
+          <w:pPr>
+            <w:pStyle w:val="TOC2"/>
+            <w:rPr>
+              <w:rFonts w:asciiTheme="minorHAnsi" w:eastAsiaTheme="minorEastAsia" w:hAnsiTheme="minorHAnsi" w:cstheme="minorBidi"/>
+              <w:noProof/>
+              <w:sz w:val="22"/>
+              <w:szCs w:val="22"/>
+              <w:lang w:eastAsia="en-US"/>
+            </w:rPr>
+          </w:pPr>
+          <w:hyperlink w:anchor="_Toc239272554" w:history="1">
+            <w:r>
+              <w:rPr>
+                <w:rStyle w:val="Hyperlink"/>
+                <w:noProof/>
+              </w:rPr>
+              <w:t>Numeric Input</w:t>
+            </w:r>
+            <w:r>
+              <w:rPr>
+                <w:noProof/>
+                <w:webHidden/>
+              </w:rPr>
+              <w:tab/>
+            </w:r>
+            <w:r>
+              <w:rPr>
+                <w:noProof/>
+                <w:webHidden/>
+              </w:rPr>
+              <w:fldChar w:fldCharType="begin"/>
+            </w:r>
+            <w:r>
+              <w:rPr>
+                <w:noProof/>
+                <w:webHidden/>
+              </w:rPr>
+              <w:instrText xml:space="preserve"> PAGEREF _Toc239272554 \h </w:instrText>
+            </w:r>
+            <w:r>
+              <w:rPr>
+                <w:noProof/>
+                <w:webHidden/>
+              </w:rPr>
+            </w:r>
+            <w:r>
+              <w:rPr>
+                <w:noProof/>
+                <w:webHidden/>
+              </w:rPr>
+              <w:fldChar w:fldCharType="separate"/>
+            </w:r>
+            <w:r>
+              <w:rPr>
+                <w:noProof/>
+                <w:webHidden/>
+              </w:rPr>
+              <w:t>2</w:t>
+            </w:r>
+            <w:r>
+              <w:rPr>
+                <w:noProof/>
+                <w:webHidden/>
+              </w:rPr>
+              <w:fldChar w:fldCharType="end"/>
+            </w:r>
+          </w:hyperlink>
+        </w:p>
+        <w:p>
+          <w:pPr>
+            <w:pStyle w:val="TOC2"/>
+            <w:rPr>
+              <w:rFonts w:asciiTheme="minorHAnsi" w:eastAsiaTheme="minorEastAsia" w:hAnsiTheme="minorHAnsi" w:cstheme="minorBidi"/>
+              <w:noProof/>
+              <w:sz w:val="22"/>
+              <w:szCs w:val="22"/>
+              <w:lang w:eastAsia="en-US"/>
+            </w:rPr>
+          </w:pPr>
+          <w:hyperlink w:anchor="_Toc239272555" w:history="1">
+            <w:r>
+              <w:rPr>
+                <w:rStyle w:val="Hyperlink"/>
+                <w:noProof/>
+              </w:rPr>
+              <w:t>Default Values</w:t>
+            </w:r>
+            <w:r>
+              <w:rPr>
+                <w:noProof/>
+                <w:webHidden/>
+              </w:rPr>
+              <w:tab/>
+            </w:r>
+            <w:r>
+              <w:rPr>
+                <w:noProof/>
+                <w:webHidden/>
+              </w:rPr>
+              <w:fldChar w:fldCharType="begin"/>
+            </w:r>
+            <w:r>
+              <w:rPr>
+                <w:noProof/>
+                <w:webHidden/>
+              </w:rPr>
+              <w:instrText xml:space="preserve"> PAGEREF _Toc239272555 \h </w:instrText>
+            </w:r>
+            <w:r>
+              <w:rPr>
+                <w:noProof/>
+                <w:webHidden/>
+              </w:rPr>
+            </w:r>
+            <w:r>
+              <w:rPr>
+                <w:noProof/>
+                <w:webHidden/>
+              </w:rPr>
+              <w:fldChar w:fldCharType="separate"/>
+            </w:r>
+            <w:r>
+              <w:rPr>
+                <w:noProof/>
+                <w:webHidden/>
+              </w:rPr>
+              <w:t>2</w:t>
+            </w:r>
+            <w:r>
+              <w:rPr>
+                <w:noProof/>
+                <w:webHidden/>
+              </w:rPr>
+              <w:fldChar w:fldCharType="end"/>
+            </w:r>
+          </w:hyperlink>
+        </w:p>
+        <w:p>
+          <w:pPr>
+            <w:pStyle w:val="TOC2"/>
+            <w:rPr>
+              <w:rFonts w:asciiTheme="minorHAnsi" w:eastAsiaTheme="minorEastAsia" w:hAnsiTheme="minorHAnsi" w:cstheme="minorBidi"/>
+              <w:noProof/>
+              <w:sz w:val="22"/>
+              <w:szCs w:val="22"/>
+              <w:lang w:eastAsia="en-US"/>
+            </w:rPr>
+          </w:pPr>
+          <w:hyperlink w:anchor="_Toc239272556" w:history="1">
+            <w:r>
+              <w:rPr>
+                <w:rStyle w:val="Hyperlink"/>
+                <w:noProof/>
+              </w:rPr>
+              <w:t>Debugging Information</w:t>
+            </w:r>
+            <w:r>
+              <w:rPr>
+                <w:noProof/>
+                <w:webHidden/>
+              </w:rPr>
+              <w:tab/>
+            </w:r>
+            <w:r>
+              <w:rPr>
+                <w:noProof/>
+                <w:webHidden/>
+              </w:rPr>
+              <w:fldChar w:fldCharType="begin"/>
+            </w:r>
+            <w:r>
+              <w:rPr>
+                <w:noProof/>
+                <w:webHidden/>
+              </w:rPr>
+              <w:instrText xml:space="preserve"> PAGEREF _Toc239272556 \h </w:instrText>
+            </w:r>
+            <w:r>
+              <w:rPr>
+                <w:noProof/>
+                <w:webHidden/>
+              </w:rPr>
+            </w:r>
+            <w:r>
+              <w:rPr>
+                <w:noProof/>
+                <w:webHidden/>
+              </w:rPr>
+              <w:fldChar w:fldCharType="separate"/>
+            </w:r>
+            <w:r>
+              <w:rPr>
+                <w:noProof/>
+                <w:webHidden/>
+              </w:rPr>
+              <w:t>2</w:t>
+            </w:r>
+            <w:r>
+              <w:rPr>
+                <w:noProof/>
+                <w:webHidden/>
+              </w:rPr>
+              <w:fldChar w:fldCharType="end"/>
+            </w:r>
+          </w:hyperlink>
+        </w:p>
+        <w:p>
+          <w:pPr>
+            <w:pStyle w:val="TOC1"/>
+            <w:rPr>
+              <w:rFonts w:asciiTheme="minorHAnsi" w:eastAsiaTheme="minorEastAsia" w:hAnsiTheme="minorHAnsi" w:cstheme="minorBidi"/>
+              <w:b w:val="0"/>
+              <w:sz w:val="22"/>
+              <w:szCs w:val="22"/>
+              <w:lang w:eastAsia="en-US"/>
+            </w:rPr>
+          </w:pPr>
+          <w:hyperlink w:anchor="_Toc239272557" w:history="1">
+            <w:r>
+              <w:rPr>
+                <w:rStyle w:val="Hyperlink"/>
+              </w:rPr>
+              <w:t>Version Numbers</w:t>
+            </w:r>
+            <w:r>
+              <w:rPr>
+                <w:webHidden/>
+              </w:rPr>
+              <w:tab/>
+            </w:r>
+            <w:r>
+              <w:rPr>
+                <w:webHidden/>
+              </w:rPr>
+              <w:fldChar w:fldCharType="begin"/>
+            </w:r>
+            <w:r>
+              <w:rPr>
+                <w:webHidden/>
+              </w:rPr>
+              <w:instrText xml:space="preserve"> PAGEREF _Toc239272557 \h </w:instrText>
+            </w:r>
+            <w:r>
+              <w:rPr>
+                <w:webHidden/>
+              </w:rPr>
+            </w:r>
+            <w:r>
+              <w:rPr>
+                <w:webHidden/>
+              </w:rPr>
+              <w:fldChar w:fldCharType="separate"/>
+            </w:r>
+            <w:r>
+              <w:rPr>
+                <w:webHidden/>
+              </w:rPr>
+              <w:t>3</w:t>
+            </w:r>
+            <w:r>
+              <w:rPr>
+                <w:webHidden/>
+              </w:rPr>
+              <w:fldChar w:fldCharType="end"/>
+            </w:r>
+          </w:hyperlink>
+        </w:p>
+        <w:p>
+          <w:pPr>
+            <w:pStyle w:val="TOC1"/>
+            <w:rPr>
+              <w:rFonts w:asciiTheme="minorHAnsi" w:eastAsiaTheme="minorEastAsia" w:hAnsiTheme="minorHAnsi" w:cstheme="minorBidi"/>
+              <w:b w:val="0"/>
+              <w:sz w:val="22"/>
+              <w:szCs w:val="22"/>
+              <w:lang w:eastAsia="en-US"/>
+            </w:rPr>
+          </w:pPr>
+          <w:hyperlink w:anchor="_Toc239272558" w:history="1">
+            <w:r>
+              <w:rPr>
+                <w:rStyle w:val="Hyperlink"/>
+              </w:rPr>
+              <w:t>Issues, Limitations, and Known Problems</w:t>
+            </w:r>
+            <w:r>
+              <w:rPr>
+                <w:webHidden/>
+              </w:rPr>
+              <w:tab/>
+            </w:r>
+            <w:r>
+              <w:rPr>
+                <w:webHidden/>
+              </w:rPr>
+              <w:fldChar w:fldCharType="begin"/>
+            </w:r>
+            <w:r>
+              <w:rPr>
+                <w:webHidden/>
+              </w:rPr>
+              <w:instrText xml:space="preserve"> PAGEREF _Toc239272558 \h </w:instrText>
+            </w:r>
+            <w:r>
+              <w:rPr>
+                <w:webHidden/>
+              </w:rPr>
+            </w:r>
+            <w:r>
+              <w:rPr>
+                <w:webHidden/>
+              </w:rPr>
+              <w:fldChar w:fldCharType="separate"/>
+            </w:r>
+            <w:r>
+              <w:rPr>
+                <w:webHidden/>
+              </w:rPr>
+              <w:t>3</w:t>
+            </w:r>
+            <w:r>
+              <w:rPr>
+                <w:webHidden/>
+              </w:rPr>
+              <w:fldChar w:fldCharType="end"/>
+            </w:r>
+          </w:hyperlink>
+        </w:p>
+        <w:p>
+          <w:pPr>
+            <w:pStyle w:val="TOC3"/>
+            <w:rPr>
+              <w:rFonts w:asciiTheme="minorHAnsi" w:eastAsiaTheme="minorEastAsia" w:hAnsiTheme="minorHAnsi" w:cstheme="minorBidi"/>
+              <w:noProof/>
+              <w:sz w:val="22"/>
+              <w:szCs w:val="22"/>
+              <w:lang w:eastAsia="en-US"/>
+            </w:rPr>
+          </w:pPr>
+          <w:hyperlink w:anchor="_Toc239272559" w:history="1">
+            <w:r>
+              <w:rPr>
+                <w:rStyle w:val="Hyperlink"/>
+                <w:noProof/>
+              </w:rPr>
+              <w:t>California Sales Tax Calculator and California Sales Tax Deduction Calculator</w:t>
+            </w:r>
+            <w:r>
+              <w:rPr>
+                <w:noProof/>
+                <w:webHidden/>
+              </w:rPr>
+              <w:tab/>
+            </w:r>
+            <w:r>
+              <w:rPr>
+                <w:noProof/>
+                <w:webHidden/>
+              </w:rPr>
+              <w:fldChar w:fldCharType="begin"/>
+            </w:r>
+            <w:r>
+              <w:rPr>
+                <w:noProof/>
+                <w:webHidden/>
+              </w:rPr>
+              <w:instrText xml:space="preserve"> PAGEREF _Toc239272559 \h </w:instrText>
+            </w:r>
+            <w:r>
+              <w:rPr>
+                <w:noProof/>
+                <w:webHidden/>
+              </w:rPr>
+            </w:r>
+            <w:r>
+              <w:rPr>
+                <w:noProof/>
+                <w:webHidden/>
+              </w:rPr>
+              <w:fldChar w:fldCharType="separate"/>
+            </w:r>
+            <w:r>
+              <w:rPr>
+                <w:noProof/>
+                <w:webHidden/>
+              </w:rPr>
+              <w:t>3</w:t>
+            </w:r>
+            <w:r>
+              <w:rPr>
+                <w:noProof/>
+                <w:webHidden/>
+              </w:rPr>
+              <w:fldChar w:fldCharType="end"/>
+            </w:r>
+          </w:hyperlink>
+        </w:p>
+        <w:p>
+          <w:pPr>
+            <w:pStyle w:val="TOC3"/>
+            <w:rPr>
+              <w:rFonts w:asciiTheme="minorHAnsi" w:eastAsiaTheme="minorEastAsia" w:hAnsiTheme="minorHAnsi" w:cstheme="minorBidi"/>
+              <w:noProof/>
+              <w:sz w:val="22"/>
+              <w:szCs w:val="22"/>
+              <w:lang w:eastAsia="en-US"/>
+            </w:rPr>
+          </w:pPr>
+          <w:hyperlink w:anchor="_Toc239272560" w:history="1">
+            <w:r>
+              <w:rPr>
+                <w:rStyle w:val="Hyperlink"/>
+                <w:noProof/>
+              </w:rPr>
+              <w:t>Estimated Tax Calculator (Federal)</w:t>
+            </w:r>
+            <w:r>
+              <w:rPr>
+                <w:noProof/>
+                <w:webHidden/>
+              </w:rPr>
+              <w:tab/>
+            </w:r>
+            <w:r>
+              <w:rPr>
+                <w:noProof/>
+                <w:webHidden/>
+              </w:rPr>
+              <w:fldChar w:fldCharType="begin"/>
+            </w:r>
+            <w:r>
+              <w:rPr>
+                <w:noProof/>
+                <w:webHidden/>
+              </w:rPr>
+              <w:instrText xml:space="preserve"> PAGEREF _Toc239272560 \h </w:instrText>
+            </w:r>
+            <w:r>
+              <w:rPr>
+                <w:noProof/>
+                <w:webHidden/>
+              </w:rPr>
+            </w:r>
+            <w:r>
+              <w:rPr>
+                <w:noProof/>
+                <w:webHidden/>
+              </w:rPr>
+              <w:fldChar w:fldCharType="separate"/>
+            </w:r>
+            <w:r>
+              <w:rPr>
+                <w:noProof/>
+                <w:webHidden/>
+              </w:rPr>
+              <w:t>4</w:t>
+            </w:r>
+            <w:r>
+              <w:rPr>
+                <w:noProof/>
+                <w:webHidden/>
+              </w:rPr>
+              <w:fldChar w:fldCharType="end"/>
+            </w:r>
+          </w:hyperlink>
+        </w:p>
+        <w:p>
+          <w:pPr>
+            <w:pStyle w:val="TOC3"/>
+            <w:rPr>
+              <w:rFonts w:asciiTheme="minorHAnsi" w:eastAsiaTheme="minorEastAsia" w:hAnsiTheme="minorHAnsi" w:cstheme="minorBidi"/>
+              <w:noProof/>
+              <w:sz w:val="22"/>
+              <w:szCs w:val="22"/>
+              <w:lang w:eastAsia="en-US"/>
+            </w:rPr>
+          </w:pPr>
+          <w:hyperlink w:anchor="_Toc239272561" w:history="1">
+            <w:r>
+              <w:rPr>
+                <w:rStyle w:val="Hyperlink"/>
+                <w:noProof/>
+              </w:rPr>
+              <w:t>Small Business Tax Calculator</w:t>
+            </w:r>
+            <w:r>
+              <w:rPr>
+                <w:noProof/>
+                <w:webHidden/>
+              </w:rPr>
+              <w:tab/>
+            </w:r>
+            <w:r>
+              <w:rPr>
+                <w:noProof/>
+                <w:webHidden/>
+              </w:rPr>
+              <w:fldChar w:fldCharType="begin"/>
+            </w:r>
+            <w:r>
+              <w:rPr>
+                <w:noProof/>
+                <w:webHidden/>
+              </w:rPr>
+              <w:instrText xml:space="preserve"> PAGEREF _Toc239272561 \h </w:instrText>
+            </w:r>
+            <w:r>
+              <w:rPr>
+                <w:noProof/>
+                <w:webHidden/>
+              </w:rPr>
+            </w:r>
+            <w:r>
+              <w:rPr>
+                <w:noProof/>
+                <w:webHidden/>
+              </w:rPr>
+              <w:fldChar w:fldCharType="separate"/>
+            </w:r>
+            <w:r>
+              <w:rPr>
+                <w:noProof/>
+                <w:webHidden/>
+              </w:rPr>
+              <w:t>4</w:t>
+            </w:r>
+            <w:r>
+              <w:rPr>
+                <w:noProof/>
+                <w:webHidden/>
+              </w:rPr>
+              <w:fldChar w:fldCharType="end"/>
+            </w:r>
+          </w:hyperlink>
+        </w:p>
+        <w:p>
+          <w:pPr>
+            <w:pStyle w:val="TOC3"/>
+            <w:rPr>
+              <w:rFonts w:asciiTheme="minorHAnsi" w:eastAsiaTheme="minorEastAsia" w:hAnsiTheme="minorHAnsi" w:cstheme="minorBidi"/>
+              <w:noProof/>
+              <w:sz w:val="22"/>
+              <w:szCs w:val="22"/>
+              <w:lang w:eastAsia="en-US"/>
+            </w:rPr>
+          </w:pPr>
+          <w:hyperlink w:anchor="_Toc239272562" w:history="1">
+            <w:r>
+              <w:rPr>
+                <w:rStyle w:val="Hyperlink"/>
+                <w:noProof/>
+              </w:rPr>
+              <w:t>Social Security - Taxable Benefits Calculator</w:t>
+            </w:r>
+            <w:r>
+              <w:rPr>
+                <w:noProof/>
+                <w:webHidden/>
+              </w:rPr>
+              <w:tab/>
+            </w:r>
+            <w:r>
+              <w:rPr>
+                <w:noProof/>
+                <w:webHidden/>
+              </w:rPr>
+              <w:fldChar w:fldCharType="begin"/>
+            </w:r>
+            <w:r>
+              <w:rPr>
+                <w:noProof/>
+                <w:webHidden/>
+              </w:rPr>
+              <w:instrText xml:space="preserve"> PAGEREF _Toc239272562 \h </w:instrText>
+            </w:r>
+            <w:r>
+              <w:rPr>
+                <w:noProof/>
+                <w:webHidden/>
+              </w:rPr>
+            </w:r>
+            <w:r>
+              <w:rPr>
+                <w:noProof/>
+                <w:webHidden/>
+              </w:rPr>
+              <w:fldChar w:fldCharType="separate"/>
+            </w:r>
+            <w:r>
+              <w:rPr>
+                <w:noProof/>
+                <w:webHidden/>
+              </w:rPr>
+              <w:t>4</w:t>
+            </w:r>
+            <w:r>
+              <w:rPr>
+                <w:noProof/>
+                <w:webHidden/>
+              </w:rPr>
+              <w:fldChar w:fldCharType="end"/>
+            </w:r>
+          </w:hyperlink>
+        </w:p>
+        <w:p>
+          <w:pPr>
+            <w:pStyle w:val="TOC3"/>
+            <w:rPr>
+              <w:rFonts w:asciiTheme="minorHAnsi" w:eastAsiaTheme="minorEastAsia" w:hAnsiTheme="minorHAnsi" w:cstheme="minorBidi"/>
+              <w:noProof/>
+              <w:sz w:val="22"/>
+              <w:szCs w:val="22"/>
+              <w:lang w:eastAsia="en-US"/>
+            </w:rPr>
+          </w:pPr>
+          <w:hyperlink w:anchor="_Toc239272563" w:history="1">
+            <w:r>
+              <w:rPr>
+                <w:rStyle w:val="Hyperlink"/>
+                <w:noProof/>
+              </w:rPr>
+              <w:t>Social Security Lump Sum Calculator</w:t>
+            </w:r>
+            <w:r>
+              <w:rPr>
+                <w:noProof/>
+                <w:webHidden/>
+              </w:rPr>
+              <w:tab/>
+            </w:r>
+            <w:r>
+              <w:rPr>
+                <w:noProof/>
+                <w:webHidden/>
+              </w:rPr>
+              <w:fldChar w:fldCharType="begin"/>
+            </w:r>
+            <w:r>
+              <w:rPr>
+                <w:noProof/>
+                <w:webHidden/>
+              </w:rPr>
+              <w:instrText xml:space="preserve"> PAGEREF _Toc239272563 \h </w:instrText>
+            </w:r>
+            <w:r>
+              <w:rPr>
+                <w:noProof/>
+                <w:webHidden/>
+              </w:rPr>
+            </w:r>
+            <w:r>
+              <w:rPr>
+                <w:noProof/>
+                <w:webHidden/>
+              </w:rPr>
+              <w:fldChar w:fldCharType="separate"/>
+            </w:r>
+            <w:r>
+              <w:rPr>
+                <w:noProof/>
+                <w:webHidden/>
+              </w:rPr>
+              <w:t>4</w:t>
+            </w:r>
+            <w:r>
+              <w:rPr>
+                <w:noProof/>
+                <w:webHidden/>
+              </w:rPr>
+              <w:fldChar w:fldCharType="end"/>
+            </w:r>
+          </w:hyperlink>
+        </w:p>
+        <w:p>
+          <w:pPr>
+            <w:pStyle w:val="TOC3"/>
+            <w:rPr>
+              <w:rFonts w:asciiTheme="minorHAnsi" w:eastAsiaTheme="minorEastAsia" w:hAnsiTheme="minorHAnsi" w:cstheme="minorBidi"/>
+              <w:noProof/>
+              <w:sz w:val="22"/>
+              <w:szCs w:val="22"/>
+              <w:lang w:eastAsia="en-US"/>
+            </w:rPr>
+          </w:pPr>
+          <w:hyperlink w:anchor="_Toc239272564" w:history="1">
+            <w:r>
+              <w:rPr>
+                <w:rStyle w:val="Hyperlink"/>
+                <w:noProof/>
+              </w:rPr>
+              <w:t>State Tax Refund Calculator</w:t>
+            </w:r>
+            <w:r>
+              <w:rPr>
+                <w:noProof/>
+                <w:webHidden/>
+              </w:rPr>
+              <w:tab/>
+            </w:r>
+            <w:r>
+              <w:rPr>
+                <w:noProof/>
+                <w:webHidden/>
+              </w:rPr>
+              <w:fldChar w:fldCharType="begin"/>
+            </w:r>
+            <w:r>
+              <w:rPr>
+                <w:noProof/>
+                <w:webHidden/>
+              </w:rPr>
+              <w:instrText xml:space="preserve"> PAGEREF _Toc239272564 \h </w:instrText>
+            </w:r>
+            <w:r>
+              <w:rPr>
+                <w:noProof/>
+                <w:webHidden/>
+              </w:rPr>
+            </w:r>
+            <w:r>
+              <w:rPr>
+                <w:noProof/>
+                <w:webHidden/>
+              </w:rPr>
+              <w:fldChar w:fldCharType="separate"/>
+            </w:r>
+            <w:r>
+              <w:rPr>
+                <w:noProof/>
+                <w:webHidden/>
+              </w:rPr>
+              <w:t>4</w:t>
+            </w:r>
+            <w:r>
+              <w:rPr>
+                <w:noProof/>
+                <w:webHidden/>
+              </w:rPr>
+              <w:fldChar w:fldCharType="end"/>
+            </w:r>
+          </w:hyperlink>
+        </w:p>
+        <w:p>
+          <w:pPr>
+            <w:pStyle w:val="TOC1"/>
+            <w:rPr>
+              <w:rFonts w:asciiTheme="minorHAnsi" w:eastAsiaTheme="minorEastAsia" w:hAnsiTheme="minorHAnsi" w:cstheme="minorBidi"/>
+              <w:b w:val="0"/>
+              <w:sz w:val="22"/>
+              <w:szCs w:val="22"/>
+              <w:lang w:eastAsia="en-US"/>
+            </w:rPr>
+          </w:pPr>
+          <w:hyperlink w:anchor="_Toc239272565" w:history="1">
+            <w:r>
+              <w:rPr>
+                <w:rStyle w:val="Hyperlink"/>
+              </w:rPr>
+              <w:t>Changes I'm Thinking About</w:t>
+            </w:r>
+            <w:r>
+              <w:rPr>
+                <w:webHidden/>
+              </w:rPr>
+              <w:tab/>
+            </w:r>
+            <w:r>
+              <w:rPr>
+                <w:webHidden/>
+              </w:rPr>
+              <w:fldChar w:fldCharType="begin"/>
+            </w:r>
+            <w:r>
+              <w:rPr>
+                <w:webHidden/>
+              </w:rPr>
+              <w:instrText xml:space="preserve"> PAGEREF _Toc239272565 \h </w:instrText>
+            </w:r>
+            <w:r>
+              <w:rPr>
+                <w:webHidden/>
+              </w:rPr>
+            </w:r>
+            <w:r>
+              <w:rPr>
+                <w:webHidden/>
+              </w:rPr>
+              <w:fldChar w:fldCharType="separate"/>
+            </w:r>
+            <w:r>
+              <w:rPr>
+                <w:webHidden/>
+              </w:rPr>
+              <w:t>4</w:t>
+            </w:r>
+            <w:r>
+              <w:rPr>
+                <w:webHidden/>
+              </w:rPr>
+              <w:fldChar w:fldCharType="end"/>
+            </w:r>
+          </w:hyperlink>
+        </w:p>
+        <w:p>
+          <w:pPr>
+            <w:pStyle w:val="TOC1"/>
+            <w:rPr>
+              <w:rFonts w:asciiTheme="minorHAnsi" w:eastAsiaTheme="minorEastAsia" w:hAnsiTheme="minorHAnsi" w:cstheme="minorBidi"/>
+              <w:b w:val="0"/>
+              <w:sz w:val="22"/>
+              <w:szCs w:val="22"/>
+              <w:lang w:eastAsia="en-US"/>
+            </w:rPr>
+          </w:pPr>
+          <w:hyperlink w:anchor="_Toc239272566" w:history="1">
+            <w:r>
+              <w:rPr>
+                <w:rStyle w:val="Hyperlink"/>
+              </w:rPr>
+              <w:t>Feedback</w:t>
+            </w:r>
+            <w:r>
+              <w:rPr>
+                <w:webHidden/>
+              </w:rPr>
+              <w:tab/>
+            </w:r>
+            <w:r>
+              <w:rPr>
+                <w:webHidden/>
+              </w:rPr>
+              <w:fldChar w:fldCharType="begin"/>
+            </w:r>
+            <w:r>
+              <w:rPr>
+                <w:webHidden/>
+              </w:rPr>
+              <w:instrText xml:space="preserve"> PAGEREF _Toc239272566 \h </w:instrText>
+            </w:r>
+            <w:r>
+              <w:rPr>
+                <w:webHidden/>
+              </w:rPr>
+            </w:r>
+            <w:r>
+              <w:rPr>
+                <w:webHidden/>
+              </w:rPr>
+              <w:fldChar w:fldCharType="separate"/>
+            </w:r>
+            <w:r>
+              <w:rPr>
+                <w:webHidden/>
+              </w:rPr>
+              <w:t>5</w:t>
+            </w:r>
+            <w:r>
+              <w:rPr>
+                <w:webHidden/>
+              </w:rPr>
+              <w:fldChar w:fldCharType="end"/>
+            </w:r>
+          </w:hyperlink>
+        </w:p>
+        <w:p>
+          <w:r>
+            <w:rPr>
+              <w:b/>
+              <w:bCs/>
+              <w:noProof/>
+            </w:rPr>
+            <w:fldChar w:fldCharType="end"/>
+          </w:r>
+        </w:p>
+      </w:sdtContent>
+    </w:sdt>
+    <w:p>
+      <w:pPr>
+        <w:pStyle w:val="Heading1"/>
+        <w:ind w:left="0" w:firstLine="0"/>
+      </w:pPr>
+      <w:bookmarkStart w:id="0" w:name="_Toc239272551"/>
+      <w:r>
+        <w:t>Introduction</w:t>
+      </w:r>
+      <w:bookmarkEnd w:id="0"/>
+    </w:p>
     <w:p>
       <w:pPr>
         <w:pStyle w:val="Body-Text"/>
@@ -100,15 +1203,7 @@
         <w:t xml:space="preserve">The </w:t>
       </w:r>
       <w:r>
-        <w:t xml:space="preserve">Tax Analysis and Experimentation Tools, or </w:t>
-      </w:r>
-      <w:proofErr w:type="spellStart"/>
-      <w:r>
-        <w:t>TAXTools</w:t>
-      </w:r>
-      <w:proofErr w:type="spellEnd"/>
-      <w:r>
-        <w:t xml:space="preserve"> for short,</w:t>
+        <w:t>Tax Analysis and Experimentation Tools, or TAXTools for short,</w:t>
       </w:r>
       <w:r>
         <w:t xml:space="preserve"> are</w:t>
@@ -247,7 +1342,7 @@
         <w:t xml:space="preserve"> </w:t>
       </w:r>
       <w:r>
-        <w:t>Program</w:t>
+        <w:t>Return Calculator</w:t>
       </w:r>
     </w:p>
     <w:p>
@@ -282,44 +1377,21 @@
       <w:r>
         <w:t xml:space="preserve"> </w:t>
       </w:r>
-      <w:hyperlink r:id="rId8" w:anchor="TaxPlanningTools" w:history="1">
+      <w:hyperlink r:id="rId8" w:history="1">
         <w:r>
           <w:rPr>
             <w:rStyle w:val="Hyperlink"/>
             <w:sz w:val="18"/>
           </w:rPr>
-          <w:t>bruceblinn.com/6-OtherStuff/Taxes/</w:t>
+          <w:t>bruceblinn.com/6-OtherStuff/Taxes/TAXToolsHomePage.html</w:t>
         </w:r>
-        <w:proofErr w:type="spellStart"/>
-        <w:r>
-          <w:rPr>
-            <w:rStyle w:val="Hyperlink"/>
-            <w:sz w:val="18"/>
-          </w:rPr>
-          <w:t>index.html#T</w:t>
-        </w:r>
-        <w:r>
-          <w:rPr>
-            <w:rStyle w:val="Hyperlink"/>
-            <w:sz w:val="18"/>
-          </w:rPr>
-          <w:t>AX</w:t>
-        </w:r>
-        <w:r>
-          <w:rPr>
-            <w:rStyle w:val="Hyperlink"/>
-            <w:sz w:val="18"/>
-          </w:rPr>
-          <w:t>Tools</w:t>
-        </w:r>
-        <w:proofErr w:type="spellEnd"/>
       </w:hyperlink>
     </w:p>
     <w:p>
       <w:pPr>
         <w:pStyle w:val="Body-Text"/>
       </w:pPr>
-      <w:bookmarkStart w:id="0" w:name="_Toc228630160"/>
+      <w:bookmarkStart w:id="1" w:name="_Toc228630160"/>
       <w:r>
         <w:t xml:space="preserve">These tools are intended to help you estimate various tax values. Since each tool estimates a </w:t>
       </w:r>
@@ -371,7 +1443,11 @@
         <w:t xml:space="preserve"> is, the more accurate </w:t>
       </w:r>
       <w:r>
-        <w:t>the calculation will be. A typical way to use these tools is to enter the information as accurately as possible</w:t>
+        <w:t xml:space="preserve">the calculation will be. A typical way to use these </w:t>
+      </w:r>
+      <w:r>
+        <w:lastRenderedPageBreak/>
+        <w:t>tools is to enter the information as accurately as possible</w:t>
       </w:r>
       <w:r>
         <w:t xml:space="preserve"> (for example, from last year’s </w:t>
@@ -434,12 +1510,14 @@
       <w:pPr>
         <w:pStyle w:val="Heading1"/>
       </w:pPr>
-      <w:bookmarkStart w:id="1" w:name="_Toc231285045"/>
+      <w:bookmarkStart w:id="2" w:name="_Toc231285045"/>
+      <w:bookmarkStart w:id="3" w:name="_Toc239272552"/>
       <w:r>
         <w:t>Interface</w:t>
       </w:r>
-      <w:bookmarkEnd w:id="0"/>
       <w:bookmarkEnd w:id="1"/>
+      <w:bookmarkEnd w:id="2"/>
+      <w:bookmarkEnd w:id="3"/>
     </w:p>
     <w:p>
       <w:pPr>
@@ -490,11 +1568,13 @@
       <w:pPr>
         <w:pStyle w:val="Heading2"/>
       </w:pPr>
-      <w:bookmarkStart w:id="2" w:name="_Toc231285046"/>
+      <w:bookmarkStart w:id="4" w:name="_Toc231285046"/>
+      <w:bookmarkStart w:id="5" w:name="_Toc239272553"/>
       <w:r>
         <w:t>Tooltips</w:t>
       </w:r>
-      <w:bookmarkEnd w:id="2"/>
+      <w:bookmarkEnd w:id="4"/>
+      <w:bookmarkEnd w:id="5"/>
     </w:p>
     <w:p>
       <w:pPr>
@@ -517,137 +1597,152 @@
       <w:pPr>
         <w:pStyle w:val="Heading2"/>
       </w:pPr>
-      <w:bookmarkStart w:id="3" w:name="_Toc231285047"/>
+      <w:bookmarkStart w:id="6" w:name="_Toc231285047"/>
+      <w:bookmarkStart w:id="7" w:name="_Toc239272554"/>
+      <w:r>
+        <w:t xml:space="preserve">Numeric </w:t>
+      </w:r>
+      <w:r>
+        <w:t>Input</w:t>
+      </w:r>
+      <w:bookmarkEnd w:id="6"/>
+      <w:bookmarkEnd w:id="7"/>
+    </w:p>
+    <w:p>
+      <w:pPr>
+        <w:pStyle w:val="Body-Text"/>
+      </w:pPr>
+      <w:r>
+        <w:t>For any input field where a numeric value is expected, dollar signs</w:t>
+      </w:r>
+      <w:r>
+        <w:t xml:space="preserve"> </w:t>
+      </w:r>
+      <w:r>
+        <w:t>($) and commas</w:t>
+      </w:r>
+      <w:r>
+        <w:t xml:space="preserve"> </w:t>
+      </w:r>
+      <w:r>
+        <w:t xml:space="preserve">(,) are ignored. This allows you to enter a number as, for example, "$40,000", "$40000", or "40000". In addition, numeric fields can contain simple arithmetic expressions. For example, you can enter "($40,000 + 4,000) * 0.075" to enter 7.5% of 44000. All numeric input will be rounded to the nearest whole number. The expression evaluator supports the following </w:t>
+      </w:r>
+      <w:r>
+        <w:t>operators</w:t>
+      </w:r>
+      <w:r>
+        <w:t>:</w:t>
+      </w:r>
+    </w:p>
+    <w:p>
+      <w:pPr>
+        <w:pStyle w:val="List-Bullet-tight025"/>
+      </w:pPr>
+      <w:r>
+        <w:t>Numbers with decimal points</w:t>
+      </w:r>
+    </w:p>
+    <w:p>
+      <w:pPr>
+        <w:pStyle w:val="List-Bullet-tight025"/>
+      </w:pPr>
+      <w:r>
+        <w:t>Operators for addition (+), subtraction (-), multiplication (*), and division (/)</w:t>
+      </w:r>
+    </w:p>
+    <w:p>
+      <w:pPr>
+        <w:pStyle w:val="List-Bullet-tight025"/>
+      </w:pPr>
+      <w:r>
+        <w:t>Unary minus operator (-)</w:t>
+      </w:r>
+    </w:p>
+    <w:p>
+      <w:pPr>
+        <w:pStyle w:val="List-Bullet-tight025"/>
+      </w:pPr>
+      <w:r>
+        <w:t>Parentheses</w:t>
+      </w:r>
+    </w:p>
+    <w:p>
+      <w:pPr>
+        <w:pStyle w:val="List-Bullet-tight025"/>
+      </w:pPr>
+      <w:r>
+        <w:t>Operator precedence for parentheses, unary minus, and for doing multiplication and division before addition and subtraction.</w:t>
+      </w:r>
+    </w:p>
+    <w:p>
+      <w:pPr>
+        <w:pStyle w:val="Heading2"/>
+      </w:pPr>
+      <w:bookmarkStart w:id="8" w:name="_Toc239272555"/>
+      <w:bookmarkStart w:id="9" w:name="_Toc231285048"/>
+      <w:r>
+        <w:t>Default Values</w:t>
+      </w:r>
+      <w:bookmarkEnd w:id="8"/>
+    </w:p>
+    <w:p>
+      <w:pPr>
+        <w:pStyle w:val="Body-Text"/>
+      </w:pPr>
+      <w:r>
+        <w:t>When a field expecting a numeric value is left blank, its value defaults to zero (0). When you enter a value in a field, that value will be used in any calculation even if the tool calculates a different value for that field. Most of the time, this behavior is what you expect to happen</w:t>
+      </w:r>
+      <w:r>
+        <w:t>; after all, if you enter a value, you expect it to be used.</w:t>
+      </w:r>
+    </w:p>
+    <w:p>
+      <w:pPr>
+        <w:pStyle w:val="Body-Text"/>
+      </w:pPr>
+      <w:r>
+        <w:t xml:space="preserve">The Tax </w:t>
+      </w:r>
+      <w:r>
+        <w:t>Return Calculator</w:t>
+      </w:r>
+      <w:r>
+        <w:t xml:space="preserve"> tool created a new problem. In that tool, you can enter just about any value in any field of any form. Any fields that do not have an entry will be calculated according to the rules for that form.</w:t>
+      </w:r>
+      <w:r>
+        <w:t xml:space="preserve"> Now, a field where you enter zero (0) means that you want it to stay zero (0) and not be calculated. Thus, an explicitly entered zero (0) and a default value of zero (0) are treated differently. Therefore, when removing a value from a field, delete the entry rather than replacing the old value with zero (0). A field that does not have an entry will display the default value in gray characters. A field where you have entered a value will display the value in dark characters.</w:t>
+      </w:r>
+    </w:p>
+    <w:p>
+      <w:pPr>
+        <w:pStyle w:val="Heading2"/>
+      </w:pPr>
+      <w:bookmarkStart w:id="10" w:name="_Toc239272556"/>
+      <w:r>
+        <w:t xml:space="preserve">Debugging </w:t>
+      </w:r>
+      <w:r>
+        <w:t>Information</w:t>
+      </w:r>
+      <w:bookmarkEnd w:id="9"/>
+      <w:bookmarkEnd w:id="10"/>
+    </w:p>
+    <w:p>
+      <w:pPr>
+        <w:pStyle w:val="Body-Text"/>
+      </w:pPr>
+      <w:r>
+        <w:t>Some of the tools can display additional information that shows internal calculations</w:t>
+      </w:r>
+      <w:r>
+        <w:t xml:space="preserve">. To see the additional information you can enter one of several keywords </w:t>
+      </w:r>
+      <w:r>
+        <w:t xml:space="preserve">in any input field. The keywords are not case-sensitive </w:t>
+      </w:r>
       <w:r>
         <w:lastRenderedPageBreak/>
-        <w:t xml:space="preserve">Numeric </w:t>
-      </w:r>
-      <w:r>
-        <w:t>Input</w:t>
-      </w:r>
-      <w:bookmarkEnd w:id="3"/>
-    </w:p>
-    <w:p>
-      <w:pPr>
-        <w:pStyle w:val="Body-Text"/>
-      </w:pPr>
-      <w:r>
-        <w:t>For any input field where a numeric value is expected, dollar signs</w:t>
-      </w:r>
-      <w:r>
-        <w:t xml:space="preserve"> </w:t>
-      </w:r>
-      <w:r>
-        <w:t>($) and commas</w:t>
-      </w:r>
-      <w:r>
-        <w:t xml:space="preserve"> </w:t>
-      </w:r>
-      <w:r>
-        <w:t xml:space="preserve">(,) are ignored. This allows you to enter a number as, for example, "$40,000", "$40000", or "40000". In addition, numeric fields can contain simple arithmetic expressions. For example, you can enter "($40,000 + 4,000) * 0.075" to enter 7.5% of 44000. All numeric input will be rounded to the nearest whole number. The expression evaluator supports the following </w:t>
-      </w:r>
-      <w:r>
-        <w:t>operators</w:t>
-      </w:r>
-      <w:r>
-        <w:t>:</w:t>
-      </w:r>
-    </w:p>
-    <w:p>
-      <w:pPr>
-        <w:pStyle w:val="List-Bullet-tight025"/>
-      </w:pPr>
-      <w:r>
-        <w:t>Numbers with decimal points</w:t>
-      </w:r>
-    </w:p>
-    <w:p>
-      <w:pPr>
-        <w:pStyle w:val="List-Bullet-tight025"/>
-      </w:pPr>
-      <w:r>
-        <w:t>Operators for addition (+), subtraction (-), multiplication (*), and division (/)</w:t>
-      </w:r>
-    </w:p>
-    <w:p>
-      <w:pPr>
-        <w:pStyle w:val="List-Bullet-tight025"/>
-      </w:pPr>
-      <w:r>
-        <w:t>Unary minus operator (-)</w:t>
-      </w:r>
-    </w:p>
-    <w:p>
-      <w:pPr>
-        <w:pStyle w:val="List-Bullet-tight025"/>
-      </w:pPr>
-      <w:r>
-        <w:t>Parentheses</w:t>
-      </w:r>
-    </w:p>
-    <w:p>
-      <w:pPr>
-        <w:pStyle w:val="List-Bullet-tight025"/>
-      </w:pPr>
-      <w:r>
-        <w:t>Operator precedence for parentheses, unary minus, and for doing multiplication and division before addition and subtraction.</w:t>
-      </w:r>
-    </w:p>
-    <w:p>
-      <w:pPr>
-        <w:pStyle w:val="Heading2"/>
-      </w:pPr>
-      <w:bookmarkStart w:id="4" w:name="_Toc231285048"/>
-      <w:r>
-        <w:t>Default Values</w:t>
-      </w:r>
-    </w:p>
-    <w:p>
-      <w:pPr>
-        <w:pStyle w:val="Body-Text"/>
-      </w:pPr>
-      <w:r>
-        <w:t>When a field expecting a numeric value is left blank, its value defaults to zero (0). When you enter a value in a field, that value will be used in any calculation even if the tool calculates a different value for that field. Most of the time, this behavior is what you expect to happen</w:t>
-      </w:r>
-      <w:r>
-        <w:t>; after all, if you enter a value, you expect it to be used.</w:t>
-      </w:r>
-    </w:p>
-    <w:p>
-      <w:pPr>
-        <w:pStyle w:val="Body-Text"/>
-      </w:pPr>
-      <w:r>
-        <w:t>The Tax Program tool created a new problem. In that tool, you can enter just about any value in any field of any form. Any fields that do not have an entry will be calculated according to the rules for that form.</w:t>
-      </w:r>
-      <w:r>
-        <w:t xml:space="preserve"> Now, a field where you enter zero (0) means that you want it to stay zero (0) and not be calculated. Thus, an explicitly entered zero (0) and a default value of zero (0) are treated differently. Therefore, when removing a value from a field, delete the entry rather than replacing the old value with zero (0). A field that does not have an entry will display the default value in gray characters. A field where you have entered a value will display the value in dark characters.</w:t>
-      </w:r>
-    </w:p>
-    <w:p>
-      <w:pPr>
-        <w:pStyle w:val="Heading2"/>
-      </w:pPr>
-      <w:r>
-        <w:t xml:space="preserve">Debugging </w:t>
-      </w:r>
-      <w:r>
-        <w:t>Information</w:t>
-      </w:r>
-      <w:bookmarkEnd w:id="4"/>
-    </w:p>
-    <w:p>
-      <w:pPr>
-        <w:pStyle w:val="Body-Text"/>
-      </w:pPr>
-      <w:r>
-        <w:t>Some of the tools can display additional information that shows internal calculations</w:t>
-      </w:r>
-      <w:r>
-        <w:t xml:space="preserve">. To see the additional information you can enter one of several keywords </w:t>
-      </w:r>
-      <w:r>
-        <w:t>in any input field. The keywords are not case-sensitive and can be entered in any order. Separate the input value and one or more keywords using commas or whitespace.</w:t>
+        <w:t>and can be entered in any order. Separate the input value and one or more keywords using commas or whitespace.</w:t>
       </w:r>
     </w:p>
     <w:p>
@@ -798,222 +1893,300 @@
       <w:pPr>
         <w:pStyle w:val="Body-Text025"/>
       </w:pPr>
-      <w:proofErr w:type="spellStart"/>
-      <w:r>
-        <w:t>IncTax</w:t>
-      </w:r>
-      <w:proofErr w:type="spellEnd"/>
+      <w:r>
+        <w:t>IncTax SalesTax SEHI Simple SSTax CA_HiIncDeductions CA_HiIncExemptions</w:t>
+      </w:r>
+    </w:p>
+    <w:p>
+      <w:pPr>
+        <w:pStyle w:val="Body-Text"/>
+      </w:pPr>
+      <w:r>
+        <w:t>By default, only the lines in a tax form</w:t>
+      </w:r>
+      <w:r>
+        <w:t xml:space="preserve"> or worksheet</w:t>
+      </w:r>
+      <w:r>
+        <w:t xml:space="preserve"> with non</w:t>
+      </w:r>
+      <w:r>
+        <w:t>-</w:t>
+      </w:r>
+      <w:r>
+        <w:t xml:space="preserve">zero values are printed. The verbose keyword can be used to </w:t>
+      </w:r>
+      <w:r>
+        <w:t>print</w:t>
+      </w:r>
+      <w:r>
+        <w:t xml:space="preserve"> all the lines.</w:t>
+      </w:r>
+    </w:p>
+    <w:p>
+      <w:pPr>
+        <w:pStyle w:val="Heading1"/>
+      </w:pPr>
+      <w:bookmarkStart w:id="11" w:name="_Toc228630163"/>
+      <w:bookmarkStart w:id="12" w:name="_Toc231285049"/>
+      <w:bookmarkStart w:id="13" w:name="_Toc239272557"/>
+      <w:bookmarkStart w:id="14" w:name="_Toc228630161"/>
+      <w:r>
+        <w:t>Version Numbers</w:t>
+      </w:r>
+      <w:bookmarkEnd w:id="11"/>
+      <w:bookmarkEnd w:id="12"/>
+      <w:bookmarkEnd w:id="13"/>
+    </w:p>
+    <w:p>
+      <w:pPr>
+        <w:pStyle w:val="Body-Text"/>
+      </w:pPr>
+      <w:r>
+        <w:t xml:space="preserve">There is a single version number for all of the </w:t>
+      </w:r>
+      <w:r>
+        <w:t>TAXTools</w:t>
+      </w:r>
+      <w:r>
+        <w:t xml:space="preserve"> because there so much shared code between the tools. </w:t>
+      </w:r>
+      <w:r>
+        <w:t>The version number is a 3-part number</w:t>
+      </w:r>
+      <w:r>
+        <w:t>, but o</w:t>
+      </w:r>
+      <w:r>
+        <w:t xml:space="preserve">nly the first two parts are </w:t>
+      </w:r>
+      <w:r>
+        <w:t xml:space="preserve">usually </w:t>
+      </w:r>
+      <w:r>
+        <w:t xml:space="preserve">present in released versions of </w:t>
+      </w:r>
+      <w:r>
+        <w:t xml:space="preserve">the </w:t>
+      </w:r>
+      <w:r>
+        <w:t>t</w:t>
+      </w:r>
+      <w:r>
+        <w:t>ools.</w:t>
+      </w:r>
+    </w:p>
+    <w:p>
+      <w:pPr>
+        <w:pStyle w:val="Body-Text"/>
+      </w:pPr>
+      <w:r>
+        <w:t xml:space="preserve">The first part of the version number corresponds to the current tax year. Sometime between April 15 </w:t>
+      </w:r>
+      <w:r>
+        <w:t>and</w:t>
+      </w:r>
+      <w:r>
+        <w:t xml:space="preserve"> early Fall, th</w:t>
+      </w:r>
+      <w:r>
+        <w:t>e</w:t>
+      </w:r>
+      <w:r>
+        <w:t xml:space="preserve"> first part of the version number is changed to the current year, and it will not be changed </w:t>
+      </w:r>
+      <w:r>
+        <w:t xml:space="preserve">again </w:t>
+      </w:r>
+      <w:r>
+        <w:t>until after the end of the tax season. When the first part of the version number is incremented, the other parts are reset.</w:t>
+      </w:r>
+    </w:p>
+    <w:p>
+      <w:pPr>
+        <w:pStyle w:val="Body-Text"/>
+      </w:pPr>
+      <w:r>
+        <w:t xml:space="preserve">The second part of the version number is the incremented each time a new version of </w:t>
+      </w:r>
+      <w:r>
+        <w:t xml:space="preserve">the </w:t>
+      </w:r>
+      <w:r>
+        <w:t>tools are</w:t>
+      </w:r>
+      <w:r>
+        <w:t xml:space="preserve"> released. There are always two versions of </w:t>
+      </w:r>
+      <w:r>
+        <w:t xml:space="preserve">the </w:t>
+      </w:r>
+      <w:r>
+        <w:t>t</w:t>
+      </w:r>
+      <w:r>
+        <w:t xml:space="preserve">ools: the released version and a </w:t>
+      </w:r>
+      <w:r>
+        <w:t>development</w:t>
+      </w:r>
+      <w:r>
+        <w:t xml:space="preserve"> version. The second part of the version number starts at 00 for the released version and 01 for the development version. Whenever the development version is merged into the released version, the second part of the version number is incremented by two in both versions. Thus, the second part of the version number in a released version is always and even number, and in the development version, it is an odd number that is one greater than the released version.</w:t>
+      </w:r>
+    </w:p>
+    <w:p>
+      <w:pPr>
+        <w:pStyle w:val="Body-Text"/>
+      </w:pPr>
+      <w:r>
+        <w:t xml:space="preserve">The third part of the version number starts at 000 and is incremented for each change. This part of the version number is </w:t>
+      </w:r>
+      <w:r>
+        <w:t>rarely</w:t>
+      </w:r>
+      <w:r>
+        <w:t xml:space="preserve"> used in the released version of </w:t>
+      </w:r>
+      <w:r>
+        <w:t xml:space="preserve">the </w:t>
+      </w:r>
+      <w:r>
+        <w:t>t</w:t>
+      </w:r>
+      <w:r>
+        <w:t>ools</w:t>
+      </w:r>
+      <w:r>
+        <w:t>.</w:t>
+      </w:r>
+    </w:p>
+    <w:p>
+      <w:pPr>
+        <w:pStyle w:val="Body-Text"/>
+      </w:pPr>
+      <w:r>
+        <w:t>In summary:</w:t>
+      </w:r>
+    </w:p>
+    <w:p>
+      <w:pPr>
+        <w:pStyle w:val="List-Bullet025"/>
+      </w:pPr>
+      <w:r>
+        <w:t>The first part of the version number is incremented each tax year.</w:t>
+      </w:r>
+    </w:p>
+    <w:p>
+      <w:pPr>
+        <w:pStyle w:val="List-Bullet025"/>
+      </w:pPr>
+      <w:r>
+        <w:t>The second part of the version number is incremented whenever the development version is merged into the released version.</w:t>
+      </w:r>
+    </w:p>
+    <w:p>
+      <w:pPr>
+        <w:pStyle w:val="List-Bullet025"/>
+      </w:pPr>
+      <w:r>
+        <w:t>And, the third part is incremented whenever the source code is changed.</w:t>
+      </w:r>
+    </w:p>
+    <w:p>
+      <w:pPr>
+        <w:pStyle w:val="Body-Text"/>
+      </w:pPr>
+      <w:r>
+        <w:t>T</w:t>
+      </w:r>
+      <w:r>
+        <w:t xml:space="preserve">he version number </w:t>
+      </w:r>
+      <w:r>
+        <w:t xml:space="preserve">of the development version is always appended with an </w:t>
+      </w:r>
+      <w:r>
+        <w:t xml:space="preserve">at sign (@) </w:t>
+      </w:r>
+      <w:r>
+        <w:t xml:space="preserve">to call attention to the </w:t>
+      </w:r>
+      <w:r>
+        <w:t>fact that that version</w:t>
+      </w:r>
       <w:r>
         <w:t xml:space="preserve"> </w:t>
       </w:r>
-      <w:proofErr w:type="spellStart"/>
-      <w:r>
-        <w:t>SalesTax</w:t>
-      </w:r>
-      <w:proofErr w:type="spellEnd"/>
-      <w:r>
-        <w:t xml:space="preserve"> SEHI Simple </w:t>
-      </w:r>
-      <w:proofErr w:type="spellStart"/>
-      <w:r>
-        <w:t>SSTax</w:t>
-      </w:r>
-      <w:proofErr w:type="spellEnd"/>
-      <w:r>
-        <w:t xml:space="preserve"> </w:t>
-      </w:r>
-      <w:proofErr w:type="spellStart"/>
-      <w:r>
-        <w:t>CA_HiIncDeductions</w:t>
-      </w:r>
-      <w:proofErr w:type="spellEnd"/>
-      <w:r>
-        <w:t xml:space="preserve"> </w:t>
-      </w:r>
-      <w:proofErr w:type="spellStart"/>
-      <w:r>
-        <w:t>CA_HiIncExemptions</w:t>
-      </w:r>
-      <w:proofErr w:type="spellEnd"/>
+      <w:r>
+        <w:t>is under development</w:t>
+      </w:r>
+      <w:r>
+        <w:t xml:space="preserve"> and </w:t>
+      </w:r>
+      <w:r>
+        <w:t>not ready to be used.</w:t>
+      </w:r>
     </w:p>
     <w:p>
       <w:pPr>
         <w:pStyle w:val="Body-Text"/>
       </w:pPr>
       <w:r>
-        <w:t>By default, only the lines in a tax form</w:t>
-      </w:r>
-      <w:r>
-        <w:t xml:space="preserve"> or worksheet</w:t>
-      </w:r>
-      <w:r>
-        <w:t xml:space="preserve"> with non</w:t>
-      </w:r>
-      <w:r>
-        <w:t>-</w:t>
-      </w:r>
-      <w:r>
-        <w:t xml:space="preserve">zero values are printed. The verbose keyword can be used to </w:t>
-      </w:r>
-      <w:r>
-        <w:t>print</w:t>
-      </w:r>
-      <w:r>
-        <w:t xml:space="preserve"> all the lines.</w:t>
+        <w:t>Whenever the version number is shown in one of the tools, it is a link that you can click</w:t>
+      </w:r>
+      <w:r>
+        <w:t xml:space="preserve"> on</w:t>
+      </w:r>
+      <w:r>
+        <w:t xml:space="preserve"> to show the version history information.</w:t>
       </w:r>
     </w:p>
     <w:p>
       <w:pPr>
         <w:pStyle w:val="Heading1"/>
       </w:pPr>
-      <w:bookmarkStart w:id="5" w:name="_Toc228630163"/>
-      <w:bookmarkStart w:id="6" w:name="_Toc231285049"/>
-      <w:bookmarkStart w:id="7" w:name="_Toc228630161"/>
+      <w:bookmarkStart w:id="15" w:name="_Toc239272558"/>
+      <w:bookmarkStart w:id="16" w:name="_Toc231285050"/>
+      <w:r>
+        <w:t>Issues, Limitations, and Known Problems</w:t>
+      </w:r>
+      <w:bookmarkEnd w:id="15"/>
+    </w:p>
+    <w:p>
+      <w:pPr>
+        <w:pStyle w:val="Heading3"/>
+      </w:pPr>
+      <w:bookmarkStart w:id="17" w:name="_Toc239272559"/>
+      <w:r>
+        <w:t>California Sales Tax Calculator and California Sales Tax Deduction Calculator</w:t>
+      </w:r>
+      <w:bookmarkEnd w:id="17"/>
+    </w:p>
+    <w:p>
+      <w:pPr>
+        <w:pStyle w:val="List-Bullet025"/>
+      </w:pPr>
+      <w:r>
+        <w:t>These calculators can only calculate the sales tax for addresses in California.</w:t>
+      </w:r>
+    </w:p>
+    <w:p>
+      <w:pPr>
+        <w:pStyle w:val="Heading3"/>
+      </w:pPr>
+      <w:bookmarkStart w:id="18" w:name="_Toc239272560"/>
       <w:r>
         <w:lastRenderedPageBreak/>
-        <w:t>Version Numbers</w:t>
-      </w:r>
-      <w:bookmarkEnd w:id="5"/>
-      <w:bookmarkEnd w:id="6"/>
-    </w:p>
-    <w:p>
-      <w:pPr>
-        <w:pStyle w:val="Body-Text"/>
-      </w:pPr>
-      <w:r>
-        <w:t xml:space="preserve">There is a single version number for all of the </w:t>
-      </w:r>
-      <w:proofErr w:type="spellStart"/>
-      <w:r>
-        <w:t>TAXTools</w:t>
-      </w:r>
-      <w:proofErr w:type="spellEnd"/>
-      <w:r>
-        <w:t xml:space="preserve"> because there so much shared code between the tools. </w:t>
-      </w:r>
-      <w:r>
-        <w:t>The version number is a 3-part number</w:t>
-      </w:r>
-      <w:r>
-        <w:t>, but o</w:t>
-      </w:r>
-      <w:r>
-        <w:t xml:space="preserve">nly the first two parts are </w:t>
-      </w:r>
-      <w:r>
-        <w:t xml:space="preserve">usually </w:t>
-      </w:r>
-      <w:r>
-        <w:t xml:space="preserve">present in released versions of </w:t>
-      </w:r>
-      <w:r>
-        <w:t xml:space="preserve">the </w:t>
-      </w:r>
-      <w:r>
-        <w:t>t</w:t>
-      </w:r>
-      <w:r>
-        <w:t>ools.</w:t>
-      </w:r>
-    </w:p>
-    <w:p>
-      <w:pPr>
-        <w:pStyle w:val="Body-Text"/>
-      </w:pPr>
-      <w:r>
-        <w:t xml:space="preserve">The first part of the version number corresponds to the current tax year. Sometime between April 15 </w:t>
-      </w:r>
-      <w:r>
-        <w:t>and</w:t>
-      </w:r>
-      <w:r>
-        <w:t xml:space="preserve"> early Fall, th</w:t>
-      </w:r>
-      <w:r>
-        <w:t>e</w:t>
-      </w:r>
-      <w:r>
-        <w:t xml:space="preserve"> first part of the version number is changed to the current year, and it will not be changed </w:t>
-      </w:r>
-      <w:r>
-        <w:t xml:space="preserve">again </w:t>
-      </w:r>
-      <w:r>
-        <w:t>until after the end of the tax season. When the first part of the version number is incremented, the other parts are reset.</w:t>
-      </w:r>
-    </w:p>
-    <w:p>
-      <w:pPr>
-        <w:pStyle w:val="Body-Text"/>
-      </w:pPr>
-      <w:r>
-        <w:t xml:space="preserve">The second part of the version number is the incremented each time a new version of </w:t>
-      </w:r>
-      <w:r>
-        <w:t xml:space="preserve">the </w:t>
-      </w:r>
-      <w:r>
-        <w:t>tools are</w:t>
-      </w:r>
-      <w:r>
-        <w:t xml:space="preserve"> released. There are always two versions of </w:t>
-      </w:r>
-      <w:r>
-        <w:t xml:space="preserve">the </w:t>
-      </w:r>
-      <w:r>
-        <w:t>t</w:t>
-      </w:r>
-      <w:r>
-        <w:t xml:space="preserve">ools: the released version and a </w:t>
-      </w:r>
-      <w:r>
-        <w:t>development</w:t>
-      </w:r>
-      <w:r>
-        <w:t xml:space="preserve"> version. The second part of the version number starts at 00 for the released version and 01 for the development version. Whenever the development version is merged into the released version, the second part of the version number is incremented by two in both versions. Thus, the second part of the version number in a released version is always and even number, and in the development version, it is an odd number that is one greater than the released version.</w:t>
-      </w:r>
-    </w:p>
-    <w:p>
-      <w:pPr>
-        <w:pStyle w:val="Body-Text"/>
-      </w:pPr>
-      <w:r>
-        <w:t xml:space="preserve">The third part of the version number starts at 000 and is incremented for each change. This part of the version number is </w:t>
-      </w:r>
-      <w:r>
-        <w:t>rarely</w:t>
-      </w:r>
-      <w:r>
-        <w:t xml:space="preserve"> used in the released version of </w:t>
-      </w:r>
-      <w:r>
-        <w:t xml:space="preserve">the </w:t>
-      </w:r>
-      <w:r>
-        <w:t>t</w:t>
-      </w:r>
-      <w:r>
-        <w:t>ools</w:t>
-      </w:r>
-      <w:r>
-        <w:t>.</w:t>
-      </w:r>
-    </w:p>
-    <w:p>
-      <w:pPr>
-        <w:pStyle w:val="Body-Text"/>
-      </w:pPr>
-      <w:r>
-        <w:t>In summary:</w:t>
-      </w:r>
+        <w:t>Estimated Tax Calculator (Federal)</w:t>
+      </w:r>
+      <w:bookmarkEnd w:id="18"/>
     </w:p>
     <w:p>
       <w:pPr>
         <w:pStyle w:val="List-Bullet025"/>
       </w:pPr>
       <w:r>
-        <w:t>The first part of the version number is incremented each tax year.</w:t>
+        <w:t>Does not support blind taxpayer or spouse.</w:t>
       </w:r>
     </w:p>
     <w:p>
@@ -1021,7 +2194,7 @@
         <w:pStyle w:val="List-Bullet025"/>
       </w:pPr>
       <w:r>
-        <w:t>The second part of the version number is incremented whenever the development version is merged into the released version.</w:t>
+        <w:t>Does not support small business (schedule C).</w:t>
       </w:r>
     </w:p>
     <w:p>
@@ -1029,89 +2202,331 @@
         <w:pStyle w:val="List-Bullet025"/>
       </w:pPr>
       <w:r>
-        <w:t>And, the third part is incremented whenever the source code is changed.</w:t>
-      </w:r>
-    </w:p>
-    <w:p>
-      <w:pPr>
-        <w:pStyle w:val="Body-Text"/>
-      </w:pPr>
-      <w:r>
-        <w:t>T</w:t>
-      </w:r>
-      <w:r>
-        <w:t xml:space="preserve">he version number </w:t>
-      </w:r>
-      <w:r>
-        <w:t xml:space="preserve">of the development version is always appended with an </w:t>
-      </w:r>
-      <w:r>
-        <w:t xml:space="preserve">at sign (@) </w:t>
-      </w:r>
-      <w:r>
-        <w:t xml:space="preserve">to call attention to the </w:t>
-      </w:r>
-      <w:r>
-        <w:t>fact that that version</w:t>
-      </w:r>
-      <w:r>
-        <w:t xml:space="preserve"> </w:t>
-      </w:r>
-      <w:r>
-        <w:t>is under development</w:t>
-      </w:r>
-      <w:r>
-        <w:t xml:space="preserve"> and </w:t>
-      </w:r>
-      <w:r>
-        <w:t>not ready to be used.</w:t>
-      </w:r>
-    </w:p>
-    <w:p>
-      <w:pPr>
-        <w:pStyle w:val="Body-Text"/>
-      </w:pPr>
-      <w:r>
-        <w:t>Whenever the version number is shown in one of the tools, it is a link that you can click</w:t>
-      </w:r>
-      <w:r>
-        <w:t xml:space="preserve"> on</w:t>
-      </w:r>
-      <w:r>
-        <w:t xml:space="preserve"> to show the version history information.</w:t>
+        <w:t>Does not support dependents.</w:t>
+      </w:r>
+    </w:p>
+    <w:p>
+      <w:pPr>
+        <w:pStyle w:val="List-Bullet025"/>
+      </w:pPr>
+      <w:r>
+        <w:t>Allows you to enter the amount of credits, but does not calculate CTC or EIC or any other credit.</w:t>
+      </w:r>
+    </w:p>
+    <w:p>
+      <w:pPr>
+        <w:pStyle w:val="Heading3"/>
+      </w:pPr>
+      <w:bookmarkStart w:id="19" w:name="_Toc239272561"/>
+      <w:r>
+        <w:t>Small Business Tax Calculator</w:t>
+      </w:r>
+      <w:bookmarkEnd w:id="19"/>
+    </w:p>
+    <w:p>
+      <w:pPr>
+        <w:pStyle w:val="List-Bullet025"/>
+      </w:pPr>
+      <w:r>
+        <w:t>The QBI calculation does not agree with TaxSlayer???</w:t>
+      </w:r>
+    </w:p>
+    <w:p>
+      <w:pPr>
+        <w:pStyle w:val="List-Bullet025"/>
+      </w:pPr>
+      <w:r>
+        <w:t>Long Term Care insurance is not separated out from medical insurance. If medical insurance includes premiums for long term care insurance, the amount entered needs to be limited by age.</w:t>
+      </w:r>
+    </w:p>
+    <w:p>
+      <w:pPr>
+        <w:pStyle w:val="List-Bullet025"/>
+      </w:pPr>
+      <w:r>
+        <w:t>This tool does not handle church employees or farm income.</w:t>
+      </w:r>
+    </w:p>
+    <w:p>
+      <w:pPr>
+        <w:pStyle w:val="List-Bullet025"/>
+      </w:pPr>
+      <w:r>
+        <w:t>The calculation will not be correct if the amount of business income plus wages is greater than the maximum amount subject to Social Security taxes.</w:t>
+      </w:r>
+    </w:p>
+    <w:p>
+      <w:pPr>
+        <w:pStyle w:val="List-Bullet025"/>
+      </w:pPr>
+      <w:r>
+        <w:t>The QBI deduction phases out at $201,775, which is not accounted for in the tool.</w:t>
+      </w:r>
+    </w:p>
+    <w:p>
+      <w:pPr>
+        <w:pStyle w:val="Heading3"/>
+      </w:pPr>
+      <w:bookmarkStart w:id="20" w:name="_Toc239272562"/>
+      <w:r>
+        <w:t>Social Security - Taxable Benefits Calculator</w:t>
+      </w:r>
+      <w:bookmarkEnd w:id="20"/>
+    </w:p>
+    <w:p>
+      <w:pPr>
+        <w:pStyle w:val="List-Bullet025"/>
+      </w:pPr>
+      <w:r>
+        <w:t>See the description for the Adjustments field in the help file. There are a few adjustments that may not be handled correctly by this tool.</w:t>
+      </w:r>
+    </w:p>
+    <w:p>
+      <w:pPr>
+        <w:pStyle w:val="List-Bullet025"/>
+      </w:pPr>
+      <w:r>
+        <w:t>If you are a non-resident alien, do not use this calculator; the taxable percentage of your Social Security is 85%.</w:t>
+      </w:r>
+    </w:p>
+    <w:p>
+      <w:pPr>
+        <w:pStyle w:val="Heading3"/>
+      </w:pPr>
+      <w:bookmarkStart w:id="21" w:name="_Toc239272563"/>
+      <w:r>
+        <w:t>Social Security Lump Sum Calculator</w:t>
+      </w:r>
+      <w:bookmarkEnd w:id="21"/>
+    </w:p>
+    <w:p>
+      <w:pPr>
+        <w:pStyle w:val="List-Bullet025"/>
+      </w:pPr>
+      <w:r>
+        <w:t>See the description for the Adjustments field. There are several adjustments that may not be handled correctly by this tool.</w:t>
+      </w:r>
+    </w:p>
+    <w:p>
+      <w:pPr>
+        <w:pStyle w:val="List-Bullet025"/>
+      </w:pPr>
+      <w:r>
+        <w:t>If you are a non-resident alien, do not use this tool; the taxable percentage of your Social Security is 85%.</w:t>
+      </w:r>
+    </w:p>
+    <w:p>
+      <w:pPr>
+        <w:pStyle w:val="List-Bullet025"/>
+      </w:pPr>
+      <w:r>
+        <w:t>If you are filing Married Filing Separately and you lived with your spouse at anytime during the tax year, do not use this tool; the taxable percentage of your Social Security is 85%.</w:t>
+      </w:r>
+    </w:p>
+    <w:p>
+      <w:pPr>
+        <w:pStyle w:val="Heading3"/>
+      </w:pPr>
+      <w:bookmarkStart w:id="22" w:name="_Toc239272564"/>
+      <w:r>
+        <w:t>State Tax Refund Calculator</w:t>
+      </w:r>
+      <w:bookmarkEnd w:id="22"/>
+    </w:p>
+    <w:p>
+      <w:pPr>
+        <w:pStyle w:val="List-Bullet025"/>
+      </w:pPr>
+      <w:r>
+        <w:t>Does not take into account that MFS may be required to itemize deductions.</w:t>
+      </w:r>
+    </w:p>
+    <w:p>
+      <w:pPr>
+        <w:pStyle w:val="Heading3"/>
+      </w:pPr>
+      <w:r>
+        <w:t>Tax Return Calculator</w:t>
+      </w:r>
+    </w:p>
+    <w:p>
+      <w:pPr>
+        <w:pStyle w:val="List-Bullet025"/>
+      </w:pPr>
+      <w:r>
+        <w:t>Does not support</w:t>
+      </w:r>
+    </w:p>
+    <w:p>
+      <w:pPr>
+        <w:pStyle w:val="List-Bullet025"/>
+        <w:numPr>
+          <w:ilvl w:val="1"/>
+          <w:numId w:val="4"/>
+        </w:numPr>
+        <w:spacing w:after="0"/>
+      </w:pPr>
+      <w:r>
+        <w:t>Dependents</w:t>
+      </w:r>
+    </w:p>
+    <w:p>
+      <w:pPr>
+        <w:pStyle w:val="List-Bullet025"/>
+        <w:numPr>
+          <w:ilvl w:val="1"/>
+          <w:numId w:val="4"/>
+        </w:numPr>
+        <w:spacing w:after="0"/>
+      </w:pPr>
+      <w:r>
+        <w:t>Affordable Care Act</w:t>
+      </w:r>
+    </w:p>
+    <w:p>
+      <w:pPr>
+        <w:pStyle w:val="List-Bullet025"/>
+        <w:numPr>
+          <w:ilvl w:val="1"/>
+          <w:numId w:val="4"/>
+        </w:numPr>
+        <w:spacing w:after="0"/>
+      </w:pPr>
+      <w:r>
+        <w:t>Credits</w:t>
+      </w:r>
+    </w:p>
+    <w:p>
+      <w:pPr>
+        <w:pStyle w:val="List-Bullet025"/>
+        <w:numPr>
+          <w:ilvl w:val="1"/>
+          <w:numId w:val="4"/>
+        </w:numPr>
+        <w:spacing w:after="0"/>
+      </w:pPr>
+      <w:r>
+        <w:t>Calculating the taxable portion of IRAs (Form 8606)</w:t>
+      </w:r>
+    </w:p>
+    <w:p>
+      <w:pPr>
+        <w:pStyle w:val="List-Bullet025"/>
+        <w:numPr>
+          <w:ilvl w:val="1"/>
+          <w:numId w:val="4"/>
+        </w:numPr>
+        <w:spacing w:after="0"/>
+      </w:pPr>
+      <w:r>
+        <w:t>Calculating the taxable portion of pensions</w:t>
+      </w:r>
+    </w:p>
+    <w:p>
+      <w:pPr>
+        <w:pStyle w:val="List-Bullet025"/>
+        <w:numPr>
+          <w:ilvl w:val="1"/>
+          <w:numId w:val="4"/>
+        </w:numPr>
+        <w:spacing w:after="0"/>
+      </w:pPr>
+      <w:r>
+        <w:t>HSA (1099-SA)</w:t>
+      </w:r>
+    </w:p>
+    <w:p>
+      <w:pPr>
+        <w:pStyle w:val="List-Bullet025"/>
+        <w:numPr>
+          <w:ilvl w:val="1"/>
+          <w:numId w:val="4"/>
+        </w:numPr>
+        <w:spacing w:after="0"/>
+      </w:pPr>
+      <w:r>
+        <w:t>Stock transactions</w:t>
+      </w:r>
+    </w:p>
+    <w:p>
+      <w:pPr>
+        <w:pStyle w:val="List-Bullet025"/>
+        <w:numPr>
+          <w:ilvl w:val="1"/>
+          <w:numId w:val="4"/>
+        </w:numPr>
+        <w:spacing w:after="0"/>
+      </w:pPr>
+      <w:r>
+        <w:t>Public Safety Officer medical insurance deduction</w:t>
+      </w:r>
+    </w:p>
+    <w:p>
+      <w:pPr>
+        <w:pStyle w:val="List-Bullet025"/>
+        <w:numPr>
+          <w:ilvl w:val="1"/>
+          <w:numId w:val="4"/>
+        </w:numPr>
+        <w:spacing w:after="0"/>
+      </w:pPr>
+      <w:r>
+        <w:t>QCD deduction from retirement account</w:t>
       </w:r>
     </w:p>
     <w:p>
       <w:pPr>
         <w:pStyle w:val="Heading1"/>
       </w:pPr>
-      <w:bookmarkStart w:id="8" w:name="_Toc231285050"/>
-      <w:r>
-        <w:t>Issues, Limitations, and Known Problems</w:t>
-      </w:r>
-    </w:p>
-    <w:p>
-      <w:pPr>
-        <w:pStyle w:val="Heading3"/>
-      </w:pPr>
-      <w:r>
-        <w:t>California Sales Tax Calculator and California Sales Tax Deduction Calculator</w:t>
-      </w:r>
+      <w:bookmarkStart w:id="23" w:name="_Toc239272565"/>
+      <w:r>
+        <w:t xml:space="preserve">Changes I'm Thinking </w:t>
+      </w:r>
+      <w:r>
+        <w:t>About</w:t>
+      </w:r>
+      <w:bookmarkEnd w:id="14"/>
+      <w:bookmarkEnd w:id="16"/>
+      <w:bookmarkEnd w:id="23"/>
     </w:p>
     <w:p>
       <w:pPr>
         <w:pStyle w:val="List-Bullet025"/>
       </w:pPr>
       <w:r>
-        <w:t>These calculators can only calculate the sales tax for addresses in California.</w:t>
-      </w:r>
-    </w:p>
-    <w:p>
-      <w:pPr>
-        <w:pStyle w:val="Heading3"/>
-      </w:pPr>
-      <w:r>
-        <w:t>Estimated Tax Calculator (Federal)</w:t>
+        <w:t>More tools</w:t>
+      </w:r>
+    </w:p>
+    <w:p>
+      <w:pPr>
+        <w:pStyle w:val="List-Bullet-tight050"/>
+      </w:pPr>
+      <w:r>
+        <w:t>CTC, EIC, and CalEITC Calculators</w:t>
+      </w:r>
+    </w:p>
+    <w:p>
+      <w:pPr>
+        <w:pStyle w:val="List-Bullet-tight050"/>
+      </w:pPr>
+      <w:r>
+        <w:t>Foreign Tax Credit Calculator</w:t>
+      </w:r>
+    </w:p>
+    <w:p>
+      <w:pPr>
+        <w:pStyle w:val="List-Bullet-tight050"/>
+      </w:pPr>
+      <w:r>
+        <w:t>Calculate penalty for underpayment of tax</w:t>
+      </w:r>
+    </w:p>
+    <w:p>
+      <w:pPr>
+        <w:pStyle w:val="List-Bullet050"/>
+      </w:pPr>
+      <w:r>
+        <w:t>Currency Exchange Rate Calculator</w:t>
       </w:r>
     </w:p>
     <w:p>
@@ -1119,7 +2534,14 @@
         <w:pStyle w:val="List-Bullet025"/>
       </w:pPr>
       <w:r>
-        <w:t>Does not support blind taxpayer or spouse.</w:t>
+        <w:lastRenderedPageBreak/>
+        <w:t xml:space="preserve">Add </w:t>
+      </w:r>
+      <w:r>
+        <w:t xml:space="preserve">more </w:t>
+      </w:r>
+      <w:r>
+        <w:t>checks to fields that have known limits so the input values do not exceed those limits.</w:t>
       </w:r>
     </w:p>
     <w:p>
@@ -1127,7 +2549,7 @@
         <w:pStyle w:val="List-Bullet025"/>
       </w:pPr>
       <w:r>
-        <w:t>Does not support small business (schedule C).</w:t>
+        <w:t>If an input field is modified internally, should the input field be updated so the user can see the corrected value?</w:t>
       </w:r>
     </w:p>
     <w:p>
@@ -1135,272 +2557,28 @@
         <w:pStyle w:val="List-Bullet025"/>
       </w:pPr>
       <w:r>
-        <w:t>Does not support dependents.</w:t>
-      </w:r>
-    </w:p>
-    <w:p>
-      <w:pPr>
-        <w:pStyle w:val="List-Bullet025"/>
-      </w:pPr>
-      <w:r>
-        <w:t>Allows you to enter the amount of credits, but does not calculate CTC or EIC or any other credit.</w:t>
-      </w:r>
-    </w:p>
-    <w:p>
-      <w:pPr>
-        <w:pStyle w:val="Heading3"/>
-      </w:pPr>
-      <w:r>
-        <w:t>Small Business Tax Calculator</w:t>
-      </w:r>
-    </w:p>
-    <w:p>
-      <w:pPr>
-        <w:pStyle w:val="List-Bullet025"/>
-      </w:pPr>
-      <w:r>
-        <w:t>The QBI calculation does not agree with TaxSlayer???</w:t>
-      </w:r>
-    </w:p>
-    <w:p>
-      <w:pPr>
-        <w:pStyle w:val="List-Bullet025"/>
-      </w:pPr>
-      <w:r>
-        <w:t>Long Term Care insurance is not separated out from medical insurance. If medical insurance includes premiums for long term care insurance, the amount entered needs to be limited by age.</w:t>
-      </w:r>
-    </w:p>
-    <w:p>
-      <w:pPr>
-        <w:pStyle w:val="List-Bullet025"/>
-      </w:pPr>
-      <w:r>
-        <w:t>This tool does not handle church employees or farm income.</w:t>
-      </w:r>
-    </w:p>
-    <w:p>
-      <w:pPr>
-        <w:pStyle w:val="List-Bullet025"/>
-      </w:pPr>
-      <w:r>
-        <w:t>The calculation will not be correct if the amount of business income plus wages is greater than the maximum amount subject to Social Security taxes.</w:t>
-      </w:r>
-    </w:p>
-    <w:p>
-      <w:pPr>
-        <w:pStyle w:val="List-Bullet025"/>
-      </w:pPr>
-      <w:r>
-        <w:t>The QBI deduction phases out at $201,775, which is not accounted for in the tool.</w:t>
-      </w:r>
-    </w:p>
-    <w:p>
-      <w:pPr>
-        <w:pStyle w:val="Heading3"/>
-      </w:pPr>
-      <w:r>
-        <w:lastRenderedPageBreak/>
-        <w:t>Social Security - Taxable Benefits Calculator</w:t>
-      </w:r>
-    </w:p>
-    <w:p>
-      <w:pPr>
-        <w:pStyle w:val="List-Bullet025"/>
-      </w:pPr>
-      <w:r>
-        <w:t>See the description for the Adjustments field in the help file. There are a few adjustments that may not be handled correctly by this tool.</w:t>
-      </w:r>
-    </w:p>
-    <w:p>
-      <w:pPr>
-        <w:pStyle w:val="List-Bullet025"/>
-      </w:pPr>
-      <w:r>
-        <w:t>If you are a non-resident alien, do not use this calculator; the taxable percentage of your Social Security is 85%.</w:t>
-      </w:r>
-    </w:p>
-    <w:p>
-      <w:pPr>
-        <w:pStyle w:val="Heading3"/>
-      </w:pPr>
-      <w:r>
-        <w:t>Social Security Lump Sum Calculator</w:t>
-      </w:r>
-    </w:p>
-    <w:p>
-      <w:pPr>
-        <w:pStyle w:val="List-Bullet025"/>
-      </w:pPr>
-      <w:r>
-        <w:t>See the description for the Adjustments field. There are several adjustments that may not be handled correctly by this tool.</w:t>
-      </w:r>
-    </w:p>
-    <w:p>
-      <w:pPr>
-        <w:pStyle w:val="List-Bullet025"/>
-      </w:pPr>
-      <w:r>
-        <w:t>If you are a non-resident alien, do not use this tool; the taxable percentage of your Social Security is 85%.</w:t>
-      </w:r>
-    </w:p>
-    <w:p>
-      <w:pPr>
-        <w:pStyle w:val="List-Bullet025"/>
-      </w:pPr>
-      <w:r>
-        <w:t>If you are filing Married Filing Separately and you lived with your spouse at anytime during the tax year, do not use this tool; the taxable percentage of your Social Security is 85%.</w:t>
-      </w:r>
-    </w:p>
-    <w:p>
-      <w:pPr>
-        <w:pStyle w:val="Heading3"/>
-      </w:pPr>
-      <w:r>
-        <w:t>State Tax Refund Calculator</w:t>
-      </w:r>
-    </w:p>
-    <w:p>
-      <w:pPr>
-        <w:pStyle w:val="List-Bullet025"/>
-      </w:pPr>
-      <w:r>
-        <w:t>Does not take into account that MFS may be required to itemize deductions.</w:t>
-      </w:r>
-    </w:p>
-    <w:p>
-      <w:pPr>
-        <w:pStyle w:val="Heading3"/>
-      </w:pPr>
-      <w:proofErr w:type="spellStart"/>
-      <w:r>
-        <w:t>TaxProgram</w:t>
-      </w:r>
-      <w:proofErr w:type="spellEnd"/>
-    </w:p>
-    <w:p>
-      <w:pPr>
-        <w:pStyle w:val="List-Bullet025"/>
-      </w:pPr>
-      <w:r>
-        <w:t xml:space="preserve">Checkboxes in output forms are not </w:t>
-      </w:r>
-      <w:proofErr w:type="spellStart"/>
-      <w:r>
-        <w:t>readonly</w:t>
-      </w:r>
-      <w:proofErr w:type="spellEnd"/>
-      <w:r>
-        <w:t>.</w:t>
+        <w:t xml:space="preserve">Should the tools be implemented as Excel </w:t>
+      </w:r>
+      <w:r>
+        <w:t>spreadsheets?</w:t>
+      </w:r>
+      <w:r>
+        <w:t xml:space="preserve"> It would allow the user to see the actual computations that are being made. Users could review the formulas for accuracy and provide feedback. They could also make changes to their copy of the spreadsheet to prototype new ideas. However, since each spreadsheet contains all the code that it uses, once it is copied, it would be difficult to know how it differs from another version. It would be impossible to update all the copies when a change needs to be made. Version control could be a nightmare.</w:t>
       </w:r>
     </w:p>
     <w:p>
       <w:pPr>
         <w:pStyle w:val="Heading1"/>
       </w:pPr>
-      <w:r>
-        <w:t xml:space="preserve">Changes I'm Thinking </w:t>
-      </w:r>
-      <w:r>
-        <w:t>About</w:t>
-      </w:r>
-      <w:bookmarkEnd w:id="7"/>
-      <w:bookmarkEnd w:id="8"/>
-    </w:p>
-    <w:p>
-      <w:pPr>
-        <w:pStyle w:val="List-Bullet025"/>
-      </w:pPr>
-      <w:r>
-        <w:t>More tools</w:t>
-      </w:r>
-    </w:p>
-    <w:p>
-      <w:pPr>
-        <w:pStyle w:val="List-Bullet-tight050"/>
-      </w:pPr>
-      <w:r>
-        <w:t xml:space="preserve">CTC, EIC, and </w:t>
-      </w:r>
-      <w:proofErr w:type="spellStart"/>
-      <w:r>
-        <w:t>CalEITC</w:t>
-      </w:r>
-      <w:proofErr w:type="spellEnd"/>
-      <w:r>
-        <w:t xml:space="preserve"> Calculators</w:t>
-      </w:r>
-    </w:p>
-    <w:p>
-      <w:pPr>
-        <w:pStyle w:val="List-Bullet-tight050"/>
-      </w:pPr>
-      <w:r>
-        <w:t>Foreign Tax Credit Calculator</w:t>
-      </w:r>
-    </w:p>
-    <w:p>
-      <w:pPr>
-        <w:pStyle w:val="List-Bullet-tight050"/>
-      </w:pPr>
-      <w:r>
-        <w:t>Calculate penalty for underpayment of tax</w:t>
-      </w:r>
-    </w:p>
-    <w:p>
-      <w:pPr>
-        <w:pStyle w:val="List-Bullet050"/>
-      </w:pPr>
-      <w:r>
-        <w:t>Currency Exchange Rate Calculator</w:t>
-      </w:r>
-    </w:p>
-    <w:p>
-      <w:pPr>
-        <w:pStyle w:val="List-Bullet025"/>
-      </w:pPr>
-      <w:r>
-        <w:t xml:space="preserve">Add </w:t>
-      </w:r>
-      <w:r>
-        <w:t xml:space="preserve">more </w:t>
-      </w:r>
-      <w:r>
-        <w:t>checks to fields that have known limits so the input values do not exceed those limits.</w:t>
-      </w:r>
-    </w:p>
-    <w:p>
-      <w:pPr>
-        <w:pStyle w:val="List-Bullet025"/>
-      </w:pPr>
-      <w:r>
-        <w:t>If an input field is modified internally, should the input field be updated so the user can see the corrected value?</w:t>
-      </w:r>
-    </w:p>
-    <w:p>
-      <w:pPr>
-        <w:pStyle w:val="List-Bullet025"/>
-      </w:pPr>
-      <w:r>
-        <w:t xml:space="preserve">Should the tools be implemented as Excel </w:t>
-      </w:r>
-      <w:r>
-        <w:t>spreadsheets?</w:t>
-      </w:r>
-      <w:r>
-        <w:t xml:space="preserve"> It would allow the user to see the actual computations that are being made. Users could review the formulas for accuracy and provide feedback. They could also make changes to their copy of the spreadsheet to prototype new ideas. However, since each spreadsheet contains all the code that it uses, once it is copied, it would be difficult to know how it differs from another version. It would be impossible to update all the copies when a change needs to be made. Version control could be a nightmare.</w:t>
-      </w:r>
-    </w:p>
-    <w:p>
-      <w:pPr>
-        <w:pStyle w:val="Heading1"/>
-      </w:pPr>
-      <w:bookmarkStart w:id="9" w:name="_Toc228630162"/>
-      <w:bookmarkStart w:id="10" w:name="_Toc231285051"/>
+      <w:bookmarkStart w:id="24" w:name="_Toc228630162"/>
+      <w:bookmarkStart w:id="25" w:name="_Toc231285051"/>
+      <w:bookmarkStart w:id="26" w:name="_Toc239272566"/>
       <w:r>
         <w:t>Feedback</w:t>
       </w:r>
-      <w:bookmarkEnd w:id="9"/>
-      <w:bookmarkEnd w:id="10"/>
+      <w:bookmarkEnd w:id="24"/>
+      <w:bookmarkEnd w:id="25"/>
+      <w:bookmarkEnd w:id="26"/>
     </w:p>
     <w:p>
       <w:pPr>
@@ -1434,7 +2612,7 @@
 </file>
 
 <file path=word/endnotes.xml><?xml version="1.0" encoding="utf-8"?>
-<w:endnotes xmlns:ve="http://schemas.openxmlformats.org/markup-compatibility/2006" xmlns:o="urn:schemas-microsoft-com:office:office" xmlns:r="http://schemas.openxmlformats.org/officeDocument/2006/relationships" xmlns:m="http://schemas.openxmlformats.org/officeDocument/2006/math" xmlns:v="urn:schemas-microsoft-com:vml" xmlns:wp="http://schemas.openxmlformats.org/drawingml/2006/wordprocessingDrawing" xmlns:w10="urn:schemas-microsoft-com:office:word" xmlns:w="http://schemas.openxmlformats.org/wordprocessingml/2006/main" xmlns:wne="http://schemas.microsoft.com/office/word/2006/wordml">
+<w:endnotes xmlns:wpc="http://schemas.microsoft.com/office/word/2010/wordprocessingCanvas" xmlns:cx="http://schemas.microsoft.com/office/drawing/2014/chartex" xmlns:cx1="http://schemas.microsoft.com/office/drawing/2015/9/8/chartex" xmlns:cx2="http://schemas.microsoft.com/office/drawing/2015/10/21/chartex" xmlns:cx3="http://schemas.microsoft.com/office/drawing/2016/5/9/chartex" xmlns:cx4="http://schemas.microsoft.com/office/drawing/2016/5/10/chartex" xmlns:cx5="http://schemas.microsoft.com/office/drawing/2016/5/11/chartex" xmlns:cx6="http://schemas.microsoft.com/office/drawing/2016/5/12/chartex" xmlns:cx7="http://schemas.microsoft.com/office/drawing/2016/5/13/chartex" xmlns:cx8="http://schemas.microsoft.com/office/drawing/2016/5/14/chartex" xmlns:mc="http://schemas.openxmlformats.org/markup-compatibility/2006" xmlns:aink="http://schemas.microsoft.com/office/drawing/2016/ink" xmlns:am3d="http://schemas.microsoft.com/office/drawing/2017/model3d" xmlns:o="urn:schemas-microsoft-com:office:office" xmlns:oel="http://schemas.microsoft.com/office/2019/extlst" xmlns:r="http://schemas.openxmlformats.org/officeDocument/2006/relationships" xmlns:m="http://schemas.openxmlformats.org/officeDocument/2006/math" xmlns:v="urn:schemas-microsoft-com:vml" xmlns:wp14="http://schemas.microsoft.com/office/word/2010/wordprocessingDrawing" xmlns:wp="http://schemas.openxmlformats.org/drawingml/2006/wordprocessingDrawing" xmlns:w10="urn:schemas-microsoft-com:office:word" xmlns:w="http://schemas.openxmlformats.org/wordprocessingml/2006/main" xmlns:w14="http://schemas.microsoft.com/office/word/2010/wordml" xmlns:w15="http://schemas.microsoft.com/office/word/2012/wordml" xmlns:w16cex="http://schemas.microsoft.com/office/word/2018/wordml/cex" xmlns:w16cid="http://schemas.microsoft.com/office/word/2016/wordml/cid" xmlns:w16="http://schemas.microsoft.com/office/word/2018/wordml" xmlns:w16du="http://schemas.microsoft.com/office/word/2023/wordml/word16du" xmlns:w16sdtdh="http://schemas.microsoft.com/office/word/2020/wordml/sdtdatahash" xmlns:w16sdtfl="http://schemas.microsoft.com/office/word/2024/wordml/sdtformatlock" xmlns:w16se="http://schemas.microsoft.com/office/word/2015/wordml/symex" xmlns:wpg="http://schemas.microsoft.com/office/word/2010/wordprocessingGroup" xmlns:wpi="http://schemas.microsoft.com/office/word/2010/wordprocessingInk" xmlns:wne="http://schemas.microsoft.com/office/word/2006/wordml" xmlns:wps="http://schemas.microsoft.com/office/word/2010/wordprocessingShape" mc:Ignorable="w14 w15 w16se w16cid w16 w16cex w16sdtdh w16sdtfl w16du wp14">
   <w:endnote w:type="separator" w:id="-1">
     <w:p>
       <w:r>
@@ -1453,7 +2631,7 @@
 </file>
 
 <file path=word/footer1.xml><?xml version="1.0" encoding="utf-8"?>
-<w:ftr xmlns:ve="http://schemas.openxmlformats.org/markup-compatibility/2006" xmlns:o="urn:schemas-microsoft-com:office:office" xmlns:r="http://schemas.openxmlformats.org/officeDocument/2006/relationships" xmlns:m="http://schemas.openxmlformats.org/officeDocument/2006/math" xmlns:v="urn:schemas-microsoft-com:vml" xmlns:wp="http://schemas.openxmlformats.org/drawingml/2006/wordprocessingDrawing" xmlns:w10="urn:schemas-microsoft-com:office:word" xmlns:w="http://schemas.openxmlformats.org/wordprocessingml/2006/main" xmlns:wne="http://schemas.microsoft.com/office/word/2006/wordml">
+<w:ftr xmlns:wpc="http://schemas.microsoft.com/office/word/2010/wordprocessingCanvas" xmlns:cx="http://schemas.microsoft.com/office/drawing/2014/chartex" xmlns:cx1="http://schemas.microsoft.com/office/drawing/2015/9/8/chartex" xmlns:cx2="http://schemas.microsoft.com/office/drawing/2015/10/21/chartex" xmlns:cx3="http://schemas.microsoft.com/office/drawing/2016/5/9/chartex" xmlns:cx4="http://schemas.microsoft.com/office/drawing/2016/5/10/chartex" xmlns:cx5="http://schemas.microsoft.com/office/drawing/2016/5/11/chartex" xmlns:cx6="http://schemas.microsoft.com/office/drawing/2016/5/12/chartex" xmlns:cx7="http://schemas.microsoft.com/office/drawing/2016/5/13/chartex" xmlns:cx8="http://schemas.microsoft.com/office/drawing/2016/5/14/chartex" xmlns:mc="http://schemas.openxmlformats.org/markup-compatibility/2006" xmlns:aink="http://schemas.microsoft.com/office/drawing/2016/ink" xmlns:am3d="http://schemas.microsoft.com/office/drawing/2017/model3d" xmlns:o="urn:schemas-microsoft-com:office:office" xmlns:oel="http://schemas.microsoft.com/office/2019/extlst" xmlns:r="http://schemas.openxmlformats.org/officeDocument/2006/relationships" xmlns:m="http://schemas.openxmlformats.org/officeDocument/2006/math" xmlns:v="urn:schemas-microsoft-com:vml" xmlns:wp14="http://schemas.microsoft.com/office/word/2010/wordprocessingDrawing" xmlns:wp="http://schemas.openxmlformats.org/drawingml/2006/wordprocessingDrawing" xmlns:w10="urn:schemas-microsoft-com:office:word" xmlns:w="http://schemas.openxmlformats.org/wordprocessingml/2006/main" xmlns:w14="http://schemas.microsoft.com/office/word/2010/wordml" xmlns:w15="http://schemas.microsoft.com/office/word/2012/wordml" xmlns:w16cex="http://schemas.microsoft.com/office/word/2018/wordml/cex" xmlns:w16cid="http://schemas.microsoft.com/office/word/2016/wordml/cid" xmlns:w16="http://schemas.microsoft.com/office/word/2018/wordml" xmlns:w16du="http://schemas.microsoft.com/office/word/2023/wordml/word16du" xmlns:w16sdtdh="http://schemas.microsoft.com/office/word/2020/wordml/sdtdatahash" xmlns:w16sdtfl="http://schemas.microsoft.com/office/word/2024/wordml/sdtformatlock" xmlns:w16se="http://schemas.microsoft.com/office/word/2015/wordml/symex" xmlns:wpg="http://schemas.microsoft.com/office/word/2010/wordprocessingGroup" xmlns:wpi="http://schemas.microsoft.com/office/word/2010/wordprocessingInk" xmlns:wne="http://schemas.microsoft.com/office/word/2006/wordml" xmlns:wps="http://schemas.microsoft.com/office/word/2010/wordprocessingShape" mc:Ignorable="w14 w15 w16se w16cid w16 w16cex w16sdtdh w16sdtfl w16du wp14">
   <w:p>
     <w:pPr>
       <w:pStyle w:val="Footer"/>
@@ -1544,7 +2722,7 @@
         <w:szCs w:val="24"/>
         <w:lang w:eastAsia="en-US"/>
       </w:rPr>
-      <w:t>1</w:t>
+      <w:t>5</w:t>
     </w:r>
     <w:r>
       <w:rPr>
@@ -1565,7 +2743,7 @@
 </file>
 
 <file path=word/footnotes.xml><?xml version="1.0" encoding="utf-8"?>
-<w:footnotes xmlns:ve="http://schemas.openxmlformats.org/markup-compatibility/2006" xmlns:o="urn:schemas-microsoft-com:office:office" xmlns:r="http://schemas.openxmlformats.org/officeDocument/2006/relationships" xmlns:m="http://schemas.openxmlformats.org/officeDocument/2006/math" xmlns:v="urn:schemas-microsoft-com:vml" xmlns:wp="http://schemas.openxmlformats.org/drawingml/2006/wordprocessingDrawing" xmlns:w10="urn:schemas-microsoft-com:office:word" xmlns:w="http://schemas.openxmlformats.org/wordprocessingml/2006/main" xmlns:wne="http://schemas.microsoft.com/office/word/2006/wordml">
+<w:footnotes xmlns:wpc="http://schemas.microsoft.com/office/word/2010/wordprocessingCanvas" xmlns:cx="http://schemas.microsoft.com/office/drawing/2014/chartex" xmlns:cx1="http://schemas.microsoft.com/office/drawing/2015/9/8/chartex" xmlns:cx2="http://schemas.microsoft.com/office/drawing/2015/10/21/chartex" xmlns:cx3="http://schemas.microsoft.com/office/drawing/2016/5/9/chartex" xmlns:cx4="http://schemas.microsoft.com/office/drawing/2016/5/10/chartex" xmlns:cx5="http://schemas.microsoft.com/office/drawing/2016/5/11/chartex" xmlns:cx6="http://schemas.microsoft.com/office/drawing/2016/5/12/chartex" xmlns:cx7="http://schemas.microsoft.com/office/drawing/2016/5/13/chartex" xmlns:cx8="http://schemas.microsoft.com/office/drawing/2016/5/14/chartex" xmlns:mc="http://schemas.openxmlformats.org/markup-compatibility/2006" xmlns:aink="http://schemas.microsoft.com/office/drawing/2016/ink" xmlns:am3d="http://schemas.microsoft.com/office/drawing/2017/model3d" xmlns:o="urn:schemas-microsoft-com:office:office" xmlns:oel="http://schemas.microsoft.com/office/2019/extlst" xmlns:r="http://schemas.openxmlformats.org/officeDocument/2006/relationships" xmlns:m="http://schemas.openxmlformats.org/officeDocument/2006/math" xmlns:v="urn:schemas-microsoft-com:vml" xmlns:wp14="http://schemas.microsoft.com/office/word/2010/wordprocessingDrawing" xmlns:wp="http://schemas.openxmlformats.org/drawingml/2006/wordprocessingDrawing" xmlns:w10="urn:schemas-microsoft-com:office:word" xmlns:w="http://schemas.openxmlformats.org/wordprocessingml/2006/main" xmlns:w14="http://schemas.microsoft.com/office/word/2010/wordml" xmlns:w15="http://schemas.microsoft.com/office/word/2012/wordml" xmlns:w16cex="http://schemas.microsoft.com/office/word/2018/wordml/cex" xmlns:w16cid="http://schemas.microsoft.com/office/word/2016/wordml/cid" xmlns:w16="http://schemas.microsoft.com/office/word/2018/wordml" xmlns:w16du="http://schemas.microsoft.com/office/word/2023/wordml/word16du" xmlns:w16sdtdh="http://schemas.microsoft.com/office/word/2020/wordml/sdtdatahash" xmlns:w16sdtfl="http://schemas.microsoft.com/office/word/2024/wordml/sdtformatlock" xmlns:w16se="http://schemas.microsoft.com/office/word/2015/wordml/symex" xmlns:wpg="http://schemas.microsoft.com/office/word/2010/wordprocessingGroup" xmlns:wpi="http://schemas.microsoft.com/office/word/2010/wordprocessingInk" xmlns:wne="http://schemas.microsoft.com/office/word/2006/wordml" xmlns:wps="http://schemas.microsoft.com/office/word/2010/wordprocessingShape" mc:Ignorable="w14 w15 w16se w16cid w16 w16cex w16sdtdh w16sdtfl w16du wp14">
   <w:footnote w:type="separator" w:id="-1">
     <w:p>
       <w:r>
@@ -1584,8 +2762,8 @@
 </file>
 
 <file path=word/numbering.xml><?xml version="1.0" encoding="utf-8"?>
-<w:numbering xmlns:ve="http://schemas.openxmlformats.org/markup-compatibility/2006" xmlns:o="urn:schemas-microsoft-com:office:office" xmlns:r="http://schemas.openxmlformats.org/officeDocument/2006/relationships" xmlns:m="http://schemas.openxmlformats.org/officeDocument/2006/math" xmlns:v="urn:schemas-microsoft-com:vml" xmlns:wp="http://schemas.openxmlformats.org/drawingml/2006/wordprocessingDrawing" xmlns:w10="urn:schemas-microsoft-com:office:word" xmlns:w="http://schemas.openxmlformats.org/wordprocessingml/2006/main" xmlns:wne="http://schemas.microsoft.com/office/word/2006/wordml">
-  <w:abstractNum w:abstractNumId="0">
+<w:numbering xmlns:wpc="http://schemas.microsoft.com/office/word/2010/wordprocessingCanvas" xmlns:cx="http://schemas.microsoft.com/office/drawing/2014/chartex" xmlns:cx1="http://schemas.microsoft.com/office/drawing/2015/9/8/chartex" xmlns:cx2="http://schemas.microsoft.com/office/drawing/2015/10/21/chartex" xmlns:cx3="http://schemas.microsoft.com/office/drawing/2016/5/9/chartex" xmlns:cx4="http://schemas.microsoft.com/office/drawing/2016/5/10/chartex" xmlns:cx5="http://schemas.microsoft.com/office/drawing/2016/5/11/chartex" xmlns:cx6="http://schemas.microsoft.com/office/drawing/2016/5/12/chartex" xmlns:cx7="http://schemas.microsoft.com/office/drawing/2016/5/13/chartex" xmlns:cx8="http://schemas.microsoft.com/office/drawing/2016/5/14/chartex" xmlns:mc="http://schemas.openxmlformats.org/markup-compatibility/2006" xmlns:aink="http://schemas.microsoft.com/office/drawing/2016/ink" xmlns:am3d="http://schemas.microsoft.com/office/drawing/2017/model3d" xmlns:o="urn:schemas-microsoft-com:office:office" xmlns:oel="http://schemas.microsoft.com/office/2019/extlst" xmlns:r="http://schemas.openxmlformats.org/officeDocument/2006/relationships" xmlns:m="http://schemas.openxmlformats.org/officeDocument/2006/math" xmlns:v="urn:schemas-microsoft-com:vml" xmlns:wp14="http://schemas.microsoft.com/office/word/2010/wordprocessingDrawing" xmlns:wp="http://schemas.openxmlformats.org/drawingml/2006/wordprocessingDrawing" xmlns:w10="urn:schemas-microsoft-com:office:word" xmlns:w="http://schemas.openxmlformats.org/wordprocessingml/2006/main" xmlns:w14="http://schemas.microsoft.com/office/word/2010/wordml" xmlns:w15="http://schemas.microsoft.com/office/word/2012/wordml" xmlns:w16cex="http://schemas.microsoft.com/office/word/2018/wordml/cex" xmlns:w16cid="http://schemas.microsoft.com/office/word/2016/wordml/cid" xmlns:w16="http://schemas.microsoft.com/office/word/2018/wordml" xmlns:w16du="http://schemas.microsoft.com/office/word/2023/wordml/word16du" xmlns:w16sdtdh="http://schemas.microsoft.com/office/word/2020/wordml/sdtdatahash" xmlns:w16sdtfl="http://schemas.microsoft.com/office/word/2024/wordml/sdtformatlock" xmlns:w16se="http://schemas.microsoft.com/office/word/2015/wordml/symex" xmlns:wpg="http://schemas.microsoft.com/office/word/2010/wordprocessingGroup" xmlns:wpi="http://schemas.microsoft.com/office/word/2010/wordprocessingInk" xmlns:wne="http://schemas.microsoft.com/office/word/2006/wordml" xmlns:wps="http://schemas.microsoft.com/office/word/2010/wordprocessingShape" mc:Ignorable="w14 w15 w16se w16cid w16 w16cex w16sdtdh w16sdtfl w16du wp14">
+  <w:abstractNum w:abstractNumId="0" w15:restartNumberingAfterBreak="0">
     <w:nsid w:val="02F34891"/>
     <w:multiLevelType w:val="hybridMultilevel"/>
     <w:tmpl w:val="32A0A55A"/>
@@ -1698,7 +2876,7 @@
       </w:pPr>
     </w:lvl>
   </w:abstractNum>
-  <w:abstractNum w:abstractNumId="1">
+  <w:abstractNum w:abstractNumId="1" w15:restartNumberingAfterBreak="0">
     <w:nsid w:val="163115D9"/>
     <w:multiLevelType w:val="hybridMultilevel"/>
     <w:tmpl w:val="97DAFCAE"/>
@@ -1812,7 +2990,7 @@
       </w:rPr>
     </w:lvl>
   </w:abstractNum>
-  <w:abstractNum w:abstractNumId="2">
+  <w:abstractNum w:abstractNumId="2" w15:restartNumberingAfterBreak="0">
     <w:nsid w:val="3D3B424D"/>
     <w:multiLevelType w:val="hybridMultilevel"/>
     <w:tmpl w:val="11DA1700"/>
@@ -1926,7 +3104,7 @@
       </w:rPr>
     </w:lvl>
   </w:abstractNum>
-  <w:abstractNum w:abstractNumId="3">
+  <w:abstractNum w:abstractNumId="3" w15:restartNumberingAfterBreak="0">
     <w:nsid w:val="41936094"/>
     <w:multiLevelType w:val="hybridMultilevel"/>
     <w:tmpl w:val="D0107CD2"/>
@@ -2040,7 +3218,7 @@
       </w:rPr>
     </w:lvl>
   </w:abstractNum>
-  <w:abstractNum w:abstractNumId="4">
+  <w:abstractNum w:abstractNumId="4" w15:restartNumberingAfterBreak="0">
     <w:nsid w:val="45145E4D"/>
     <w:multiLevelType w:val="hybridMultilevel"/>
     <w:tmpl w:val="7696BC50"/>
@@ -2057,7 +3235,7 @@
         <w:rFonts w:ascii="Symbol" w:hAnsi="Symbol" w:hint="default"/>
       </w:rPr>
     </w:lvl>
-    <w:lvl w:ilvl="1" w:tplc="04090003" w:tentative="1">
+    <w:lvl w:ilvl="1" w:tplc="04090003">
       <w:start w:val="1"/>
       <w:numFmt w:val="bullet"/>
       <w:lvlText w:val="o"/>
@@ -2154,7 +3332,7 @@
       </w:rPr>
     </w:lvl>
   </w:abstractNum>
-  <w:abstractNum w:abstractNumId="5">
+  <w:abstractNum w:abstractNumId="5" w15:restartNumberingAfterBreak="0">
     <w:nsid w:val="521C37A8"/>
     <w:multiLevelType w:val="hybridMultilevel"/>
     <w:tmpl w:val="AB9275FC"/>
@@ -2267,46 +3445,46 @@
       </w:rPr>
     </w:lvl>
   </w:abstractNum>
-  <w:num w:numId="1">
+  <w:num w:numId="1" w16cid:durableId="1401557070">
     <w:abstractNumId w:val="2"/>
   </w:num>
-  <w:num w:numId="2">
+  <w:num w:numId="2" w16cid:durableId="216626179">
     <w:abstractNumId w:val="3"/>
   </w:num>
-  <w:num w:numId="3">
+  <w:num w:numId="3" w16cid:durableId="27687066">
     <w:abstractNumId w:val="1"/>
   </w:num>
-  <w:num w:numId="4">
+  <w:num w:numId="4" w16cid:durableId="222915658">
     <w:abstractNumId w:val="4"/>
   </w:num>
-  <w:num w:numId="5">
+  <w:num w:numId="5" w16cid:durableId="1660504200">
     <w:abstractNumId w:val="0"/>
   </w:num>
-  <w:num w:numId="6">
+  <w:num w:numId="6" w16cid:durableId="1536230726">
     <w:abstractNumId w:val="5"/>
   </w:num>
-  <w:num w:numId="7">
+  <w:num w:numId="7" w16cid:durableId="334646480">
     <w:abstractNumId w:val="4"/>
   </w:num>
-  <w:num w:numId="8">
+  <w:num w:numId="8" w16cid:durableId="40717789">
     <w:abstractNumId w:val="4"/>
   </w:num>
-  <w:num w:numId="9">
+  <w:num w:numId="9" w16cid:durableId="1296523423">
     <w:abstractNumId w:val="4"/>
   </w:num>
-  <w:num w:numId="10">
+  <w:num w:numId="10" w16cid:durableId="1182014343">
     <w:abstractNumId w:val="4"/>
   </w:num>
-  <w:num w:numId="11">
+  <w:num w:numId="11" w16cid:durableId="1716806817">
     <w:abstractNumId w:val="4"/>
   </w:num>
-  <w:num w:numId="12">
+  <w:num w:numId="12" w16cid:durableId="156894017">
     <w:abstractNumId w:val="4"/>
   </w:num>
-  <w:num w:numId="13">
+  <w:num w:numId="13" w16cid:durableId="905842339">
     <w:abstractNumId w:val="4"/>
   </w:num>
-  <w:num w:numId="14">
+  <w:num w:numId="14" w16cid:durableId="1090352381">
     <w:abstractNumId w:val="4"/>
   </w:num>
   <w:numIdMacAtCleanup w:val="4"/>
@@ -2314,7 +3492,7 @@
 </file>
 
 <file path=word/styles.xml><?xml version="1.0" encoding="utf-8"?>
-<w:styles xmlns:r="http://schemas.openxmlformats.org/officeDocument/2006/relationships" xmlns:w="http://schemas.openxmlformats.org/wordprocessingml/2006/main">
+<w:styles xmlns:mc="http://schemas.openxmlformats.org/markup-compatibility/2006" xmlns:r="http://schemas.openxmlformats.org/officeDocument/2006/relationships" xmlns:w="http://schemas.openxmlformats.org/wordprocessingml/2006/main" xmlns:w14="http://schemas.microsoft.com/office/word/2010/wordml" xmlns:w15="http://schemas.microsoft.com/office/word/2012/wordml" xmlns:w16cex="http://schemas.microsoft.com/office/word/2018/wordml/cex" xmlns:w16cid="http://schemas.microsoft.com/office/word/2016/wordml/cid" xmlns:w16="http://schemas.microsoft.com/office/word/2018/wordml" xmlns:w16du="http://schemas.microsoft.com/office/word/2023/wordml/word16du" xmlns:w16sdtdh="http://schemas.microsoft.com/office/word/2020/wordml/sdtdatahash" xmlns:w16sdtfl="http://schemas.microsoft.com/office/word/2024/wordml/sdtformatlock" xmlns:w16se="http://schemas.microsoft.com/office/word/2015/wordml/symex" mc:Ignorable="w14 w15 w16se w16cid w16 w16cex w16sdtdh w16sdtfl w16du">
   <w:docDefaults>
     <w:rPrDefault>
       <w:rPr>
@@ -2328,145 +3506,383 @@
       </w:pPr>
     </w:pPrDefault>
   </w:docDefaults>
-  <w:latentStyles w:defLockedState="0" w:defUIPriority="99" w:defSemiHidden="1" w:defUnhideWhenUsed="1" w:defQFormat="0" w:count="267">
-    <w:lsdException w:name="Normal" w:semiHidden="0" w:uiPriority="0" w:unhideWhenUsed="0" w:qFormat="1"/>
-    <w:lsdException w:name="heading 1" w:semiHidden="0" w:uiPriority="0" w:unhideWhenUsed="0" w:qFormat="1"/>
-    <w:lsdException w:name="heading 2" w:uiPriority="0" w:qFormat="1"/>
-    <w:lsdException w:name="heading 3" w:uiPriority="0" w:qFormat="1"/>
-    <w:lsdException w:name="heading 4" w:uiPriority="9" w:qFormat="1"/>
-    <w:lsdException w:name="heading 5" w:uiPriority="9" w:qFormat="1"/>
-    <w:lsdException w:name="heading 6" w:uiPriority="9" w:qFormat="1"/>
-    <w:lsdException w:name="heading 7" w:uiPriority="9" w:qFormat="1"/>
-    <w:lsdException w:name="heading 8" w:uiPriority="9" w:qFormat="1"/>
-    <w:lsdException w:name="heading 9" w:uiPriority="9" w:qFormat="1"/>
-    <w:lsdException w:name="toc 1" w:uiPriority="39" w:qFormat="1"/>
-    <w:lsdException w:name="toc 2" w:uiPriority="39" w:qFormat="1"/>
-    <w:lsdException w:name="toc 3" w:uiPriority="39" w:qFormat="1"/>
-    <w:lsdException w:name="toc 4" w:uiPriority="39"/>
-    <w:lsdException w:name="toc 5" w:uiPriority="39"/>
-    <w:lsdException w:name="toc 6" w:uiPriority="39"/>
-    <w:lsdException w:name="toc 7" w:uiPriority="39"/>
-    <w:lsdException w:name="toc 8" w:uiPriority="39"/>
-    <w:lsdException w:name="toc 9" w:uiPriority="39"/>
-    <w:lsdException w:name="footer" w:uiPriority="0"/>
-    <w:lsdException w:name="caption" w:uiPriority="0" w:qFormat="1"/>
-    <w:lsdException w:name="Title" w:semiHidden="0" w:uiPriority="10" w:unhideWhenUsed="0" w:qFormat="1"/>
-    <w:lsdException w:name="Default Paragraph Font" w:uiPriority="1"/>
-    <w:lsdException w:name="Subtitle" w:semiHidden="0" w:uiPriority="11" w:unhideWhenUsed="0" w:qFormat="1"/>
-    <w:lsdException w:name="Strong" w:semiHidden="0" w:uiPriority="22" w:unhideWhenUsed="0" w:qFormat="1"/>
-    <w:lsdException w:name="Emphasis" w:semiHidden="0" w:uiPriority="20" w:unhideWhenUsed="0" w:qFormat="1"/>
-    <w:lsdException w:name="Table Grid" w:semiHidden="0" w:uiPriority="59" w:unhideWhenUsed="0"/>
-    <w:lsdException w:name="Placeholder Text" w:unhideWhenUsed="0"/>
-    <w:lsdException w:name="No Spacing" w:semiHidden="0" w:uiPriority="1" w:unhideWhenUsed="0" w:qFormat="1"/>
-    <w:lsdException w:name="Light Shading" w:semiHidden="0" w:uiPriority="60" w:unhideWhenUsed="0"/>
-    <w:lsdException w:name="Light List" w:semiHidden="0" w:uiPriority="61" w:unhideWhenUsed="0"/>
-    <w:lsdException w:name="Light Grid" w:semiHidden="0" w:uiPriority="62" w:unhideWhenUsed="0"/>
-    <w:lsdException w:name="Medium Shading 1" w:semiHidden="0" w:uiPriority="63" w:unhideWhenUsed="0"/>
-    <w:lsdException w:name="Medium Shading 2" w:semiHidden="0" w:uiPriority="64" w:unhideWhenUsed="0"/>
-    <w:lsdException w:name="Medium List 1" w:semiHidden="0" w:uiPriority="65" w:unhideWhenUsed="0"/>
-    <w:lsdException w:name="Medium List 2" w:semiHidden="0" w:uiPriority="66" w:unhideWhenUsed="0"/>
-    <w:lsdException w:name="Medium Grid 1" w:semiHidden="0" w:uiPriority="67" w:unhideWhenUsed="0"/>
-    <w:lsdException w:name="Medium Grid 2" w:semiHidden="0" w:uiPriority="68" w:unhideWhenUsed="0"/>
-    <w:lsdException w:name="Medium Grid 3" w:semiHidden="0" w:uiPriority="69" w:unhideWhenUsed="0"/>
-    <w:lsdException w:name="Dark List" w:semiHidden="0" w:uiPriority="70" w:unhideWhenUsed="0"/>
-    <w:lsdException w:name="Colorful Shading" w:semiHidden="0" w:uiPriority="71" w:unhideWhenUsed="0"/>
-    <w:lsdException w:name="Colorful List" w:semiHidden="0" w:uiPriority="72" w:unhideWhenUsed="0"/>
-    <w:lsdException w:name="Colorful Grid" w:semiHidden="0" w:uiPriority="73" w:unhideWhenUsed="0"/>
-    <w:lsdException w:name="Light Shading Accent 1" w:semiHidden="0" w:uiPriority="60" w:unhideWhenUsed="0"/>
-    <w:lsdException w:name="Light List Accent 1" w:semiHidden="0" w:uiPriority="61" w:unhideWhenUsed="0"/>
-    <w:lsdException w:name="Light Grid Accent 1" w:semiHidden="0" w:uiPriority="62" w:unhideWhenUsed="0"/>
-    <w:lsdException w:name="Medium Shading 1 Accent 1" w:semiHidden="0" w:uiPriority="63" w:unhideWhenUsed="0"/>
-    <w:lsdException w:name="Medium Shading 2 Accent 1" w:semiHidden="0" w:uiPriority="64" w:unhideWhenUsed="0"/>
-    <w:lsdException w:name="Medium List 1 Accent 1" w:semiHidden="0" w:uiPriority="65" w:unhideWhenUsed="0"/>
-    <w:lsdException w:name="Revision" w:unhideWhenUsed="0"/>
-    <w:lsdException w:name="List Paragraph" w:semiHidden="0" w:uiPriority="34" w:unhideWhenUsed="0" w:qFormat="1"/>
-    <w:lsdException w:name="Quote" w:semiHidden="0" w:uiPriority="29" w:unhideWhenUsed="0" w:qFormat="1"/>
-    <w:lsdException w:name="Intense Quote" w:semiHidden="0" w:uiPriority="30" w:unhideWhenUsed="0" w:qFormat="1"/>
-    <w:lsdException w:name="Medium List 2 Accent 1" w:semiHidden="0" w:uiPriority="66" w:unhideWhenUsed="0"/>
-    <w:lsdException w:name="Medium Grid 1 Accent 1" w:semiHidden="0" w:uiPriority="67" w:unhideWhenUsed="0"/>
-    <w:lsdException w:name="Medium Grid 2 Accent 1" w:semiHidden="0" w:uiPriority="68" w:unhideWhenUsed="0"/>
-    <w:lsdException w:name="Medium Grid 3 Accent 1" w:semiHidden="0" w:uiPriority="69" w:unhideWhenUsed="0"/>
-    <w:lsdException w:name="Dark List Accent 1" w:semiHidden="0" w:uiPriority="70" w:unhideWhenUsed="0"/>
-    <w:lsdException w:name="Colorful Shading Accent 1" w:semiHidden="0" w:uiPriority="71" w:unhideWhenUsed="0"/>
-    <w:lsdException w:name="Colorful List Accent 1" w:semiHidden="0" w:uiPriority="72" w:unhideWhenUsed="0"/>
-    <w:lsdException w:name="Colorful Grid Accent 1" w:semiHidden="0" w:uiPriority="73" w:unhideWhenUsed="0"/>
-    <w:lsdException w:name="Light Shading Accent 2" w:semiHidden="0" w:uiPriority="60" w:unhideWhenUsed="0"/>
-    <w:lsdException w:name="Light List Accent 2" w:semiHidden="0" w:uiPriority="61" w:unhideWhenUsed="0"/>
-    <w:lsdException w:name="Light Grid Accent 2" w:semiHidden="0" w:uiPriority="62" w:unhideWhenUsed="0"/>
-    <w:lsdException w:name="Medium Shading 1 Accent 2" w:semiHidden="0" w:uiPriority="63" w:unhideWhenUsed="0"/>
-    <w:lsdException w:name="Medium Shading 2 Accent 2" w:semiHidden="0" w:uiPriority="64" w:unhideWhenUsed="0"/>
-    <w:lsdException w:name="Medium List 1 Accent 2" w:semiHidden="0" w:uiPriority="65" w:unhideWhenUsed="0"/>
-    <w:lsdException w:name="Medium List 2 Accent 2" w:semiHidden="0" w:uiPriority="66" w:unhideWhenUsed="0"/>
-    <w:lsdException w:name="Medium Grid 1 Accent 2" w:semiHidden="0" w:uiPriority="67" w:unhideWhenUsed="0"/>
-    <w:lsdException w:name="Medium Grid 2 Accent 2" w:semiHidden="0" w:uiPriority="68" w:unhideWhenUsed="0"/>
-    <w:lsdException w:name="Medium Grid 3 Accent 2" w:semiHidden="0" w:uiPriority="69" w:unhideWhenUsed="0"/>
-    <w:lsdException w:name="Dark List Accent 2" w:semiHidden="0" w:uiPriority="70" w:unhideWhenUsed="0"/>
-    <w:lsdException w:name="Colorful Shading Accent 2" w:semiHidden="0" w:uiPriority="71" w:unhideWhenUsed="0"/>
-    <w:lsdException w:name="Colorful List Accent 2" w:semiHidden="0" w:uiPriority="72" w:unhideWhenUsed="0"/>
-    <w:lsdException w:name="Colorful Grid Accent 2" w:semiHidden="0" w:uiPriority="73" w:unhideWhenUsed="0"/>
-    <w:lsdException w:name="Light Shading Accent 3" w:semiHidden="0" w:uiPriority="60" w:unhideWhenUsed="0"/>
-    <w:lsdException w:name="Light List Accent 3" w:semiHidden="0" w:uiPriority="61" w:unhideWhenUsed="0"/>
-    <w:lsdException w:name="Light Grid Accent 3" w:semiHidden="0" w:uiPriority="62" w:unhideWhenUsed="0"/>
-    <w:lsdException w:name="Medium Shading 1 Accent 3" w:semiHidden="0" w:uiPriority="63" w:unhideWhenUsed="0"/>
-    <w:lsdException w:name="Medium Shading 2 Accent 3" w:semiHidden="0" w:uiPriority="64" w:unhideWhenUsed="0"/>
-    <w:lsdException w:name="Medium List 1 Accent 3" w:semiHidden="0" w:uiPriority="65" w:unhideWhenUsed="0"/>
-    <w:lsdException w:name="Medium List 2 Accent 3" w:semiHidden="0" w:uiPriority="66" w:unhideWhenUsed="0"/>
-    <w:lsdException w:name="Medium Grid 1 Accent 3" w:semiHidden="0" w:uiPriority="67" w:unhideWhenUsed="0"/>
-    <w:lsdException w:name="Medium Grid 2 Accent 3" w:semiHidden="0" w:uiPriority="68" w:unhideWhenUsed="0"/>
-    <w:lsdException w:name="Medium Grid 3 Accent 3" w:semiHidden="0" w:uiPriority="69" w:unhideWhenUsed="0"/>
-    <w:lsdException w:name="Dark List Accent 3" w:semiHidden="0" w:uiPriority="70" w:unhideWhenUsed="0"/>
-    <w:lsdException w:name="Colorful Shading Accent 3" w:semiHidden="0" w:uiPriority="71" w:unhideWhenUsed="0"/>
-    <w:lsdException w:name="Colorful List Accent 3" w:semiHidden="0" w:uiPriority="72" w:unhideWhenUsed="0"/>
-    <w:lsdException w:name="Colorful Grid Accent 3" w:semiHidden="0" w:uiPriority="73" w:unhideWhenUsed="0"/>
-    <w:lsdException w:name="Light Shading Accent 4" w:semiHidden="0" w:uiPriority="60" w:unhideWhenUsed="0"/>
-    <w:lsdException w:name="Light List Accent 4" w:semiHidden="0" w:uiPriority="61" w:unhideWhenUsed="0"/>
-    <w:lsdException w:name="Light Grid Accent 4" w:semiHidden="0" w:uiPriority="62" w:unhideWhenUsed="0"/>
-    <w:lsdException w:name="Medium Shading 1 Accent 4" w:semiHidden="0" w:uiPriority="63" w:unhideWhenUsed="0"/>
-    <w:lsdException w:name="Medium Shading 2 Accent 4" w:semiHidden="0" w:uiPriority="64" w:unhideWhenUsed="0"/>
-    <w:lsdException w:name="Medium List 1 Accent 4" w:semiHidden="0" w:uiPriority="65" w:unhideWhenUsed="0"/>
-    <w:lsdException w:name="Medium List 2 Accent 4" w:semiHidden="0" w:uiPriority="66" w:unhideWhenUsed="0"/>
-    <w:lsdException w:name="Medium Grid 1 Accent 4" w:semiHidden="0" w:uiPriority="67" w:unhideWhenUsed="0"/>
-    <w:lsdException w:name="Medium Grid 2 Accent 4" w:semiHidden="0" w:uiPriority="68" w:unhideWhenUsed="0"/>
-    <w:lsdException w:name="Medium Grid 3 Accent 4" w:semiHidden="0" w:uiPriority="69" w:unhideWhenUsed="0"/>
-    <w:lsdException w:name="Dark List Accent 4" w:semiHidden="0" w:uiPriority="70" w:unhideWhenUsed="0"/>
-    <w:lsdException w:name="Colorful Shading Accent 4" w:semiHidden="0" w:uiPriority="71" w:unhideWhenUsed="0"/>
-    <w:lsdException w:name="Colorful List Accent 4" w:semiHidden="0" w:uiPriority="72" w:unhideWhenUsed="0"/>
-    <w:lsdException w:name="Colorful Grid Accent 4" w:semiHidden="0" w:uiPriority="73" w:unhideWhenUsed="0"/>
-    <w:lsdException w:name="Light Shading Accent 5" w:semiHidden="0" w:uiPriority="60" w:unhideWhenUsed="0"/>
-    <w:lsdException w:name="Light List Accent 5" w:semiHidden="0" w:uiPriority="61" w:unhideWhenUsed="0"/>
-    <w:lsdException w:name="Light Grid Accent 5" w:semiHidden="0" w:uiPriority="62" w:unhideWhenUsed="0"/>
-    <w:lsdException w:name="Medium Shading 1 Accent 5" w:semiHidden="0" w:uiPriority="63" w:unhideWhenUsed="0"/>
-    <w:lsdException w:name="Medium Shading 2 Accent 5" w:semiHidden="0" w:uiPriority="64" w:unhideWhenUsed="0"/>
-    <w:lsdException w:name="Medium List 1 Accent 5" w:semiHidden="0" w:uiPriority="65" w:unhideWhenUsed="0"/>
-    <w:lsdException w:name="Medium List 2 Accent 5" w:semiHidden="0" w:uiPriority="66" w:unhideWhenUsed="0"/>
-    <w:lsdException w:name="Medium Grid 1 Accent 5" w:semiHidden="0" w:uiPriority="67" w:unhideWhenUsed="0"/>
-    <w:lsdException w:name="Medium Grid 2 Accent 5" w:semiHidden="0" w:uiPriority="68" w:unhideWhenUsed="0"/>
-    <w:lsdException w:name="Medium Grid 3 Accent 5" w:semiHidden="0" w:uiPriority="69" w:unhideWhenUsed="0"/>
-    <w:lsdException w:name="Dark List Accent 5" w:semiHidden="0" w:uiPriority="70" w:unhideWhenUsed="0"/>
-    <w:lsdException w:name="Colorful Shading Accent 5" w:semiHidden="0" w:uiPriority="71" w:unhideWhenUsed="0"/>
-    <w:lsdException w:name="Colorful List Accent 5" w:semiHidden="0" w:uiPriority="72" w:unhideWhenUsed="0"/>
-    <w:lsdException w:name="Colorful Grid Accent 5" w:semiHidden="0" w:uiPriority="73" w:unhideWhenUsed="0"/>
-    <w:lsdException w:name="Light Shading Accent 6" w:semiHidden="0" w:uiPriority="60" w:unhideWhenUsed="0"/>
-    <w:lsdException w:name="Light List Accent 6" w:semiHidden="0" w:uiPriority="61" w:unhideWhenUsed="0"/>
-    <w:lsdException w:name="Light Grid Accent 6" w:semiHidden="0" w:uiPriority="62" w:unhideWhenUsed="0"/>
-    <w:lsdException w:name="Medium Shading 1 Accent 6" w:semiHidden="0" w:uiPriority="63" w:unhideWhenUsed="0"/>
-    <w:lsdException w:name="Medium Shading 2 Accent 6" w:semiHidden="0" w:uiPriority="64" w:unhideWhenUsed="0"/>
-    <w:lsdException w:name="Medium List 1 Accent 6" w:semiHidden="0" w:uiPriority="65" w:unhideWhenUsed="0"/>
-    <w:lsdException w:name="Medium List 2 Accent 6" w:semiHidden="0" w:uiPriority="66" w:unhideWhenUsed="0"/>
-    <w:lsdException w:name="Medium Grid 1 Accent 6" w:semiHidden="0" w:uiPriority="67" w:unhideWhenUsed="0"/>
-    <w:lsdException w:name="Medium Grid 2 Accent 6" w:semiHidden="0" w:uiPriority="68" w:unhideWhenUsed="0"/>
-    <w:lsdException w:name="Medium Grid 3 Accent 6" w:semiHidden="0" w:uiPriority="69" w:unhideWhenUsed="0"/>
-    <w:lsdException w:name="Dark List Accent 6" w:semiHidden="0" w:uiPriority="70" w:unhideWhenUsed="0"/>
-    <w:lsdException w:name="Colorful Shading Accent 6" w:semiHidden="0" w:uiPriority="71" w:unhideWhenUsed="0"/>
-    <w:lsdException w:name="Colorful List Accent 6" w:semiHidden="0" w:uiPriority="72" w:unhideWhenUsed="0"/>
-    <w:lsdException w:name="Colorful Grid Accent 6" w:semiHidden="0" w:uiPriority="73" w:unhideWhenUsed="0"/>
-    <w:lsdException w:name="Subtle Emphasis" w:semiHidden="0" w:uiPriority="19" w:unhideWhenUsed="0" w:qFormat="1"/>
-    <w:lsdException w:name="Intense Emphasis" w:semiHidden="0" w:uiPriority="21" w:unhideWhenUsed="0" w:qFormat="1"/>
-    <w:lsdException w:name="Subtle Reference" w:semiHidden="0" w:uiPriority="31" w:unhideWhenUsed="0" w:qFormat="1"/>
-    <w:lsdException w:name="Intense Reference" w:semiHidden="0" w:uiPriority="32" w:unhideWhenUsed="0" w:qFormat="1"/>
-    <w:lsdException w:name="Book Title" w:semiHidden="0" w:uiPriority="33" w:unhideWhenUsed="0" w:qFormat="1"/>
-    <w:lsdException w:name="Bibliography" w:uiPriority="37"/>
-    <w:lsdException w:name="TOC Heading" w:uiPriority="39" w:qFormat="1"/>
+  <w:latentStyles w:defLockedState="0" w:defUIPriority="99" w:defSemiHidden="0" w:defUnhideWhenUsed="0" w:defQFormat="0" w:count="376">
+    <w:lsdException w:name="Normal" w:uiPriority="0" w:qFormat="1"/>
+    <w:lsdException w:name="heading 1" w:uiPriority="0" w:qFormat="1"/>
+    <w:lsdException w:name="heading 2" w:semiHidden="1" w:uiPriority="0" w:unhideWhenUsed="1" w:qFormat="1"/>
+    <w:lsdException w:name="heading 3" w:semiHidden="1" w:uiPriority="0" w:unhideWhenUsed="1" w:qFormat="1"/>
+    <w:lsdException w:name="heading 4" w:semiHidden="1" w:uiPriority="9" w:unhideWhenUsed="1" w:qFormat="1"/>
+    <w:lsdException w:name="heading 5" w:semiHidden="1" w:uiPriority="9" w:unhideWhenUsed="1" w:qFormat="1"/>
+    <w:lsdException w:name="heading 6" w:semiHidden="1" w:uiPriority="9" w:unhideWhenUsed="1" w:qFormat="1"/>
+    <w:lsdException w:name="heading 7" w:semiHidden="1" w:uiPriority="9" w:unhideWhenUsed="1" w:qFormat="1"/>
+    <w:lsdException w:name="heading 8" w:semiHidden="1" w:uiPriority="9" w:unhideWhenUsed="1" w:qFormat="1"/>
+    <w:lsdException w:name="heading 9" w:semiHidden="1" w:uiPriority="9" w:unhideWhenUsed="1" w:qFormat="1"/>
+    <w:lsdException w:name="index 1" w:semiHidden="1" w:unhideWhenUsed="1"/>
+    <w:lsdException w:name="index 2" w:semiHidden="1" w:unhideWhenUsed="1"/>
+    <w:lsdException w:name="index 3" w:semiHidden="1" w:unhideWhenUsed="1"/>
+    <w:lsdException w:name="index 4" w:semiHidden="1" w:unhideWhenUsed="1"/>
+    <w:lsdException w:name="index 5" w:semiHidden="1" w:unhideWhenUsed="1"/>
+    <w:lsdException w:name="index 6" w:semiHidden="1" w:unhideWhenUsed="1"/>
+    <w:lsdException w:name="index 7" w:semiHidden="1" w:unhideWhenUsed="1"/>
+    <w:lsdException w:name="index 8" w:semiHidden="1" w:unhideWhenUsed="1"/>
+    <w:lsdException w:name="index 9" w:semiHidden="1" w:unhideWhenUsed="1"/>
+    <w:lsdException w:name="toc 1" w:semiHidden="1" w:uiPriority="39" w:unhideWhenUsed="1" w:qFormat="1"/>
+    <w:lsdException w:name="toc 2" w:semiHidden="1" w:uiPriority="39" w:unhideWhenUsed="1" w:qFormat="1"/>
+    <w:lsdException w:name="toc 3" w:semiHidden="1" w:uiPriority="39" w:unhideWhenUsed="1" w:qFormat="1"/>
+    <w:lsdException w:name="toc 4" w:semiHidden="1" w:uiPriority="39" w:unhideWhenUsed="1"/>
+    <w:lsdException w:name="toc 5" w:semiHidden="1" w:uiPriority="39" w:unhideWhenUsed="1"/>
+    <w:lsdException w:name="toc 6" w:semiHidden="1" w:uiPriority="39" w:unhideWhenUsed="1"/>
+    <w:lsdException w:name="toc 7" w:semiHidden="1" w:uiPriority="39" w:unhideWhenUsed="1"/>
+    <w:lsdException w:name="toc 8" w:semiHidden="1" w:uiPriority="39" w:unhideWhenUsed="1"/>
+    <w:lsdException w:name="toc 9" w:semiHidden="1" w:uiPriority="39" w:unhideWhenUsed="1"/>
+    <w:lsdException w:name="Normal Indent" w:semiHidden="1" w:unhideWhenUsed="1"/>
+    <w:lsdException w:name="footnote text" w:semiHidden="1" w:unhideWhenUsed="1"/>
+    <w:lsdException w:name="annotation text" w:semiHidden="1" w:unhideWhenUsed="1"/>
+    <w:lsdException w:name="header" w:semiHidden="1" w:unhideWhenUsed="1"/>
+    <w:lsdException w:name="footer" w:semiHidden="1" w:uiPriority="0" w:unhideWhenUsed="1"/>
+    <w:lsdException w:name="index heading" w:semiHidden="1" w:unhideWhenUsed="1"/>
+    <w:lsdException w:name="caption" w:semiHidden="1" w:uiPriority="0" w:unhideWhenUsed="1" w:qFormat="1"/>
+    <w:lsdException w:name="table of figures" w:semiHidden="1" w:unhideWhenUsed="1"/>
+    <w:lsdException w:name="envelope address" w:semiHidden="1" w:unhideWhenUsed="1"/>
+    <w:lsdException w:name="envelope return" w:semiHidden="1" w:unhideWhenUsed="1"/>
+    <w:lsdException w:name="footnote reference" w:semiHidden="1" w:unhideWhenUsed="1"/>
+    <w:lsdException w:name="annotation reference" w:semiHidden="1" w:unhideWhenUsed="1"/>
+    <w:lsdException w:name="line number" w:semiHidden="1" w:unhideWhenUsed="1"/>
+    <w:lsdException w:name="page number" w:semiHidden="1" w:unhideWhenUsed="1"/>
+    <w:lsdException w:name="endnote reference" w:semiHidden="1" w:unhideWhenUsed="1"/>
+    <w:lsdException w:name="endnote text" w:semiHidden="1" w:unhideWhenUsed="1"/>
+    <w:lsdException w:name="table of authorities" w:semiHidden="1" w:unhideWhenUsed="1"/>
+    <w:lsdException w:name="macro" w:semiHidden="1" w:unhideWhenUsed="1"/>
+    <w:lsdException w:name="toa heading" w:semiHidden="1" w:unhideWhenUsed="1"/>
+    <w:lsdException w:name="List" w:semiHidden="1" w:unhideWhenUsed="1"/>
+    <w:lsdException w:name="List Bullet" w:semiHidden="1" w:unhideWhenUsed="1"/>
+    <w:lsdException w:name="List Number" w:semiHidden="1" w:unhideWhenUsed="1"/>
+    <w:lsdException w:name="List 2" w:semiHidden="1" w:unhideWhenUsed="1"/>
+    <w:lsdException w:name="List 3" w:semiHidden="1" w:unhideWhenUsed="1"/>
+    <w:lsdException w:name="List 4" w:semiHidden="1" w:unhideWhenUsed="1"/>
+    <w:lsdException w:name="List 5" w:semiHidden="1" w:unhideWhenUsed="1"/>
+    <w:lsdException w:name="List Bullet 2" w:semiHidden="1" w:unhideWhenUsed="1"/>
+    <w:lsdException w:name="List Bullet 3" w:semiHidden="1" w:unhideWhenUsed="1"/>
+    <w:lsdException w:name="List Bullet 4" w:semiHidden="1" w:unhideWhenUsed="1"/>
+    <w:lsdException w:name="List Bullet 5" w:semiHidden="1" w:unhideWhenUsed="1"/>
+    <w:lsdException w:name="List Number 2" w:semiHidden="1" w:unhideWhenUsed="1"/>
+    <w:lsdException w:name="List Number 3" w:semiHidden="1" w:unhideWhenUsed="1"/>
+    <w:lsdException w:name="List Number 4" w:semiHidden="1" w:unhideWhenUsed="1"/>
+    <w:lsdException w:name="List Number 5" w:semiHidden="1" w:unhideWhenUsed="1"/>
+    <w:lsdException w:name="Title" w:uiPriority="10" w:qFormat="1"/>
+    <w:lsdException w:name="Closing" w:semiHidden="1" w:unhideWhenUsed="1"/>
+    <w:lsdException w:name="Signature" w:semiHidden="1" w:unhideWhenUsed="1"/>
+    <w:lsdException w:name="Default Paragraph Font" w:semiHidden="1" w:uiPriority="1" w:unhideWhenUsed="1"/>
+    <w:lsdException w:name="Body Text" w:semiHidden="1" w:unhideWhenUsed="1"/>
+    <w:lsdException w:name="Body Text Indent" w:semiHidden="1" w:unhideWhenUsed="1"/>
+    <w:lsdException w:name="List Continue" w:semiHidden="1" w:unhideWhenUsed="1"/>
+    <w:lsdException w:name="List Continue 2" w:semiHidden="1" w:unhideWhenUsed="1"/>
+    <w:lsdException w:name="List Continue 3" w:semiHidden="1" w:unhideWhenUsed="1"/>
+    <w:lsdException w:name="List Continue 4" w:semiHidden="1" w:unhideWhenUsed="1"/>
+    <w:lsdException w:name="List Continue 5" w:semiHidden="1" w:unhideWhenUsed="1"/>
+    <w:lsdException w:name="Message Header" w:semiHidden="1" w:unhideWhenUsed="1"/>
+    <w:lsdException w:name="Subtitle" w:uiPriority="11" w:qFormat="1"/>
+    <w:lsdException w:name="Salutation" w:semiHidden="1" w:unhideWhenUsed="1"/>
+    <w:lsdException w:name="Date" w:semiHidden="1" w:unhideWhenUsed="1"/>
+    <w:lsdException w:name="Body Text First Indent" w:semiHidden="1" w:unhideWhenUsed="1"/>
+    <w:lsdException w:name="Body Text First Indent 2" w:semiHidden="1" w:unhideWhenUsed="1"/>
+    <w:lsdException w:name="Note Heading" w:semiHidden="1" w:unhideWhenUsed="1"/>
+    <w:lsdException w:name="Body Text 2" w:semiHidden="1" w:unhideWhenUsed="1"/>
+    <w:lsdException w:name="Body Text 3" w:semiHidden="1" w:unhideWhenUsed="1"/>
+    <w:lsdException w:name="Body Text Indent 2" w:semiHidden="1" w:unhideWhenUsed="1"/>
+    <w:lsdException w:name="Body Text Indent 3" w:semiHidden="1" w:unhideWhenUsed="1"/>
+    <w:lsdException w:name="Block Text" w:semiHidden="1" w:unhideWhenUsed="1"/>
+    <w:lsdException w:name="Hyperlink" w:semiHidden="1" w:unhideWhenUsed="1"/>
+    <w:lsdException w:name="FollowedHyperlink" w:semiHidden="1" w:unhideWhenUsed="1"/>
+    <w:lsdException w:name="Strong" w:uiPriority="22" w:qFormat="1"/>
+    <w:lsdException w:name="Emphasis" w:uiPriority="20" w:qFormat="1"/>
+    <w:lsdException w:name="Document Map" w:semiHidden="1" w:unhideWhenUsed="1"/>
+    <w:lsdException w:name="Plain Text" w:semiHidden="1" w:unhideWhenUsed="1"/>
+    <w:lsdException w:name="E-mail Signature" w:semiHidden="1" w:unhideWhenUsed="1"/>
+    <w:lsdException w:name="HTML Top of Form" w:semiHidden="1" w:unhideWhenUsed="1"/>
+    <w:lsdException w:name="HTML Bottom of Form" w:semiHidden="1" w:unhideWhenUsed="1"/>
+    <w:lsdException w:name="Normal (Web)" w:semiHidden="1" w:unhideWhenUsed="1"/>
+    <w:lsdException w:name="HTML Acronym" w:semiHidden="1" w:unhideWhenUsed="1"/>
+    <w:lsdException w:name="HTML Address" w:semiHidden="1" w:unhideWhenUsed="1"/>
+    <w:lsdException w:name="HTML Cite" w:semiHidden="1" w:unhideWhenUsed="1"/>
+    <w:lsdException w:name="HTML Code" w:semiHidden="1" w:unhideWhenUsed="1"/>
+    <w:lsdException w:name="HTML Definition" w:semiHidden="1" w:unhideWhenUsed="1"/>
+    <w:lsdException w:name="HTML Keyboard" w:semiHidden="1" w:unhideWhenUsed="1"/>
+    <w:lsdException w:name="HTML Preformatted" w:semiHidden="1" w:unhideWhenUsed="1"/>
+    <w:lsdException w:name="HTML Sample" w:semiHidden="1" w:unhideWhenUsed="1"/>
+    <w:lsdException w:name="HTML Typewriter" w:semiHidden="1" w:unhideWhenUsed="1"/>
+    <w:lsdException w:name="HTML Variable" w:semiHidden="1" w:unhideWhenUsed="1"/>
+    <w:lsdException w:name="Normal Table" w:semiHidden="1" w:unhideWhenUsed="1"/>
+    <w:lsdException w:name="annotation subject" w:semiHidden="1" w:unhideWhenUsed="1"/>
+    <w:lsdException w:name="No List" w:semiHidden="1" w:unhideWhenUsed="1"/>
+    <w:lsdException w:name="Outline List 1" w:semiHidden="1" w:unhideWhenUsed="1"/>
+    <w:lsdException w:name="Outline List 2" w:semiHidden="1" w:unhideWhenUsed="1"/>
+    <w:lsdException w:name="Outline List 3" w:semiHidden="1" w:unhideWhenUsed="1"/>
+    <w:lsdException w:name="Table Simple 1" w:semiHidden="1" w:unhideWhenUsed="1"/>
+    <w:lsdException w:name="Table Simple 2" w:semiHidden="1" w:unhideWhenUsed="1"/>
+    <w:lsdException w:name="Table Simple 3" w:semiHidden="1" w:unhideWhenUsed="1"/>
+    <w:lsdException w:name="Table Classic 1" w:semiHidden="1" w:unhideWhenUsed="1"/>
+    <w:lsdException w:name="Table Classic 2" w:semiHidden="1" w:unhideWhenUsed="1"/>
+    <w:lsdException w:name="Table Classic 3" w:semiHidden="1" w:unhideWhenUsed="1"/>
+    <w:lsdException w:name="Table Classic 4" w:semiHidden="1" w:unhideWhenUsed="1"/>
+    <w:lsdException w:name="Table Colorful 1" w:semiHidden="1" w:unhideWhenUsed="1"/>
+    <w:lsdException w:name="Table Colorful 2" w:semiHidden="1" w:unhideWhenUsed="1"/>
+    <w:lsdException w:name="Table Colorful 3" w:semiHidden="1" w:unhideWhenUsed="1"/>
+    <w:lsdException w:name="Table Columns 1" w:semiHidden="1" w:unhideWhenUsed="1"/>
+    <w:lsdException w:name="Table Columns 2" w:semiHidden="1" w:unhideWhenUsed="1"/>
+    <w:lsdException w:name="Table Columns 3" w:semiHidden="1" w:unhideWhenUsed="1"/>
+    <w:lsdException w:name="Table Columns 4" w:semiHidden="1" w:unhideWhenUsed="1"/>
+    <w:lsdException w:name="Table Columns 5" w:semiHidden="1" w:unhideWhenUsed="1"/>
+    <w:lsdException w:name="Table Grid 1" w:semiHidden="1" w:unhideWhenUsed="1"/>
+    <w:lsdException w:name="Table Grid 2" w:semiHidden="1" w:unhideWhenUsed="1"/>
+    <w:lsdException w:name="Table Grid 3" w:semiHidden="1" w:unhideWhenUsed="1"/>
+    <w:lsdException w:name="Table Grid 4" w:semiHidden="1" w:unhideWhenUsed="1"/>
+    <w:lsdException w:name="Table Grid 5" w:semiHidden="1" w:unhideWhenUsed="1"/>
+    <w:lsdException w:name="Table Grid 6" w:semiHidden="1" w:unhideWhenUsed="1"/>
+    <w:lsdException w:name="Table Grid 7" w:semiHidden="1" w:unhideWhenUsed="1"/>
+    <w:lsdException w:name="Table Grid 8" w:semiHidden="1" w:unhideWhenUsed="1"/>
+    <w:lsdException w:name="Table List 1" w:semiHidden="1" w:unhideWhenUsed="1"/>
+    <w:lsdException w:name="Table List 2" w:semiHidden="1" w:unhideWhenUsed="1"/>
+    <w:lsdException w:name="Table List 3" w:semiHidden="1" w:unhideWhenUsed="1"/>
+    <w:lsdException w:name="Table List 4" w:semiHidden="1" w:unhideWhenUsed="1"/>
+    <w:lsdException w:name="Table List 5" w:semiHidden="1" w:unhideWhenUsed="1"/>
+    <w:lsdException w:name="Table List 6" w:semiHidden="1" w:unhideWhenUsed="1"/>
+    <w:lsdException w:name="Table List 7" w:semiHidden="1" w:unhideWhenUsed="1"/>
+    <w:lsdException w:name="Table List 8" w:semiHidden="1" w:unhideWhenUsed="1"/>
+    <w:lsdException w:name="Table 3D effects 1" w:semiHidden="1" w:unhideWhenUsed="1"/>
+    <w:lsdException w:name="Table 3D effects 2" w:semiHidden="1" w:unhideWhenUsed="1"/>
+    <w:lsdException w:name="Table 3D effects 3" w:semiHidden="1" w:unhideWhenUsed="1"/>
+    <w:lsdException w:name="Table Contemporary" w:semiHidden="1" w:unhideWhenUsed="1"/>
+    <w:lsdException w:name="Table Elegant" w:semiHidden="1" w:unhideWhenUsed="1"/>
+    <w:lsdException w:name="Table Professional" w:semiHidden="1" w:unhideWhenUsed="1"/>
+    <w:lsdException w:name="Table Subtle 1" w:semiHidden="1" w:unhideWhenUsed="1"/>
+    <w:lsdException w:name="Table Subtle 2" w:semiHidden="1" w:unhideWhenUsed="1"/>
+    <w:lsdException w:name="Table Web 1" w:semiHidden="1" w:unhideWhenUsed="1"/>
+    <w:lsdException w:name="Table Web 2" w:semiHidden="1" w:unhideWhenUsed="1"/>
+    <w:lsdException w:name="Table Web 3" w:semiHidden="1" w:unhideWhenUsed="1"/>
+    <w:lsdException w:name="Balloon Text" w:semiHidden="1" w:unhideWhenUsed="1"/>
+    <w:lsdException w:name="Table Grid" w:uiPriority="59"/>
+    <w:lsdException w:name="Table Theme" w:semiHidden="1" w:unhideWhenUsed="1"/>
+    <w:lsdException w:name="Placeholder Text" w:semiHidden="1"/>
+    <w:lsdException w:name="No Spacing" w:uiPriority="1" w:qFormat="1"/>
+    <w:lsdException w:name="Light Shading" w:uiPriority="60"/>
+    <w:lsdException w:name="Light List" w:uiPriority="61"/>
+    <w:lsdException w:name="Light Grid" w:uiPriority="62"/>
+    <w:lsdException w:name="Medium Shading 1" w:uiPriority="63"/>
+    <w:lsdException w:name="Medium Shading 2" w:uiPriority="64"/>
+    <w:lsdException w:name="Medium List 1" w:uiPriority="65"/>
+    <w:lsdException w:name="Medium List 2" w:uiPriority="66"/>
+    <w:lsdException w:name="Medium Grid 1" w:uiPriority="67"/>
+    <w:lsdException w:name="Medium Grid 2" w:uiPriority="68"/>
+    <w:lsdException w:name="Medium Grid 3" w:uiPriority="69"/>
+    <w:lsdException w:name="Dark List" w:uiPriority="70"/>
+    <w:lsdException w:name="Colorful Shading" w:uiPriority="71"/>
+    <w:lsdException w:name="Colorful List" w:uiPriority="72"/>
+    <w:lsdException w:name="Colorful Grid" w:uiPriority="73"/>
+    <w:lsdException w:name="Light Shading Accent 1" w:uiPriority="60"/>
+    <w:lsdException w:name="Light List Accent 1" w:uiPriority="61"/>
+    <w:lsdException w:name="Light Grid Accent 1" w:uiPriority="62"/>
+    <w:lsdException w:name="Medium Shading 1 Accent 1" w:uiPriority="63"/>
+    <w:lsdException w:name="Medium Shading 2 Accent 1" w:uiPriority="64"/>
+    <w:lsdException w:name="Medium List 1 Accent 1" w:uiPriority="65"/>
+    <w:lsdException w:name="Revision" w:semiHidden="1"/>
+    <w:lsdException w:name="List Paragraph" w:uiPriority="34" w:qFormat="1"/>
+    <w:lsdException w:name="Quote" w:uiPriority="29" w:qFormat="1"/>
+    <w:lsdException w:name="Intense Quote" w:uiPriority="30" w:qFormat="1"/>
+    <w:lsdException w:name="Medium List 2 Accent 1" w:uiPriority="66"/>
+    <w:lsdException w:name="Medium Grid 1 Accent 1" w:uiPriority="67"/>
+    <w:lsdException w:name="Medium Grid 2 Accent 1" w:uiPriority="68"/>
+    <w:lsdException w:name="Medium Grid 3 Accent 1" w:uiPriority="69"/>
+    <w:lsdException w:name="Dark List Accent 1" w:uiPriority="70"/>
+    <w:lsdException w:name="Colorful Shading Accent 1" w:uiPriority="71"/>
+    <w:lsdException w:name="Colorful List Accent 1" w:uiPriority="72"/>
+    <w:lsdException w:name="Colorful Grid Accent 1" w:uiPriority="73"/>
+    <w:lsdException w:name="Light Shading Accent 2" w:uiPriority="60"/>
+    <w:lsdException w:name="Light List Accent 2" w:uiPriority="61"/>
+    <w:lsdException w:name="Light Grid Accent 2" w:uiPriority="62"/>
+    <w:lsdException w:name="Medium Shading 1 Accent 2" w:uiPriority="63"/>
+    <w:lsdException w:name="Medium Shading 2 Accent 2" w:uiPriority="64"/>
+    <w:lsdException w:name="Medium List 1 Accent 2" w:uiPriority="65"/>
+    <w:lsdException w:name="Medium List 2 Accent 2" w:uiPriority="66"/>
+    <w:lsdException w:name="Medium Grid 1 Accent 2" w:uiPriority="67"/>
+    <w:lsdException w:name="Medium Grid 2 Accent 2" w:uiPriority="68"/>
+    <w:lsdException w:name="Medium Grid 3 Accent 2" w:uiPriority="69"/>
+    <w:lsdException w:name="Dark List Accent 2" w:uiPriority="70"/>
+    <w:lsdException w:name="Colorful Shading Accent 2" w:uiPriority="71"/>
+    <w:lsdException w:name="Colorful List Accent 2" w:uiPriority="72"/>
+    <w:lsdException w:name="Colorful Grid Accent 2" w:uiPriority="73"/>
+    <w:lsdException w:name="Light Shading Accent 3" w:uiPriority="60"/>
+    <w:lsdException w:name="Light List Accent 3" w:uiPriority="61"/>
+    <w:lsdException w:name="Light Grid Accent 3" w:uiPriority="62"/>
+    <w:lsdException w:name="Medium Shading 1 Accent 3" w:uiPriority="63"/>
+    <w:lsdException w:name="Medium Shading 2 Accent 3" w:uiPriority="64"/>
+    <w:lsdException w:name="Medium List 1 Accent 3" w:uiPriority="65"/>
+    <w:lsdException w:name="Medium List 2 Accent 3" w:uiPriority="66"/>
+    <w:lsdException w:name="Medium Grid 1 Accent 3" w:uiPriority="67"/>
+    <w:lsdException w:name="Medium Grid 2 Accent 3" w:uiPriority="68"/>
+    <w:lsdException w:name="Medium Grid 3 Accent 3" w:uiPriority="69"/>
+    <w:lsdException w:name="Dark List Accent 3" w:uiPriority="70"/>
+    <w:lsdException w:name="Colorful Shading Accent 3" w:uiPriority="71"/>
+    <w:lsdException w:name="Colorful List Accent 3" w:uiPriority="72"/>
+    <w:lsdException w:name="Colorful Grid Accent 3" w:uiPriority="73"/>
+    <w:lsdException w:name="Light Shading Accent 4" w:uiPriority="60"/>
+    <w:lsdException w:name="Light List Accent 4" w:uiPriority="61"/>
+    <w:lsdException w:name="Light Grid Accent 4" w:uiPriority="62"/>
+    <w:lsdException w:name="Medium Shading 1 Accent 4" w:uiPriority="63"/>
+    <w:lsdException w:name="Medium Shading 2 Accent 4" w:uiPriority="64"/>
+    <w:lsdException w:name="Medium List 1 Accent 4" w:uiPriority="65"/>
+    <w:lsdException w:name="Medium List 2 Accent 4" w:uiPriority="66"/>
+    <w:lsdException w:name="Medium Grid 1 Accent 4" w:uiPriority="67"/>
+    <w:lsdException w:name="Medium Grid 2 Accent 4" w:uiPriority="68"/>
+    <w:lsdException w:name="Medium Grid 3 Accent 4" w:uiPriority="69"/>
+    <w:lsdException w:name="Dark List Accent 4" w:uiPriority="70"/>
+    <w:lsdException w:name="Colorful Shading Accent 4" w:uiPriority="71"/>
+    <w:lsdException w:name="Colorful List Accent 4" w:uiPriority="72"/>
+    <w:lsdException w:name="Colorful Grid Accent 4" w:uiPriority="73"/>
+    <w:lsdException w:name="Light Shading Accent 5" w:uiPriority="60"/>
+    <w:lsdException w:name="Light List Accent 5" w:uiPriority="61"/>
+    <w:lsdException w:name="Light Grid Accent 5" w:uiPriority="62"/>
+    <w:lsdException w:name="Medium Shading 1 Accent 5" w:uiPriority="63"/>
+    <w:lsdException w:name="Medium Shading 2 Accent 5" w:uiPriority="64"/>
+    <w:lsdException w:name="Medium List 1 Accent 5" w:uiPriority="65"/>
+    <w:lsdException w:name="Medium List 2 Accent 5" w:uiPriority="66"/>
+    <w:lsdException w:name="Medium Grid 1 Accent 5" w:uiPriority="67"/>
+    <w:lsdException w:name="Medium Grid 2 Accent 5" w:uiPriority="68"/>
+    <w:lsdException w:name="Medium Grid 3 Accent 5" w:uiPriority="69"/>
+    <w:lsdException w:name="Dark List Accent 5" w:uiPriority="70"/>
+    <w:lsdException w:name="Colorful Shading Accent 5" w:uiPriority="71"/>
+    <w:lsdException w:name="Colorful List Accent 5" w:uiPriority="72"/>
+    <w:lsdException w:name="Colorful Grid Accent 5" w:uiPriority="73"/>
+    <w:lsdException w:name="Light Shading Accent 6" w:uiPriority="60"/>
+    <w:lsdException w:name="Light List Accent 6" w:uiPriority="61"/>
+    <w:lsdException w:name="Light Grid Accent 6" w:uiPriority="62"/>
+    <w:lsdException w:name="Medium Shading 1 Accent 6" w:uiPriority="63"/>
+    <w:lsdException w:name="Medium Shading 2 Accent 6" w:uiPriority="64"/>
+    <w:lsdException w:name="Medium List 1 Accent 6" w:uiPriority="65"/>
+    <w:lsdException w:name="Medium List 2 Accent 6" w:uiPriority="66"/>
+    <w:lsdException w:name="Medium Grid 1 Accent 6" w:uiPriority="67"/>
+    <w:lsdException w:name="Medium Grid 2 Accent 6" w:uiPriority="68"/>
+    <w:lsdException w:name="Medium Grid 3 Accent 6" w:uiPriority="69"/>
+    <w:lsdException w:name="Dark List Accent 6" w:uiPriority="70"/>
+    <w:lsdException w:name="Colorful Shading Accent 6" w:uiPriority="71"/>
+    <w:lsdException w:name="Colorful List Accent 6" w:uiPriority="72"/>
+    <w:lsdException w:name="Colorful Grid Accent 6" w:uiPriority="73"/>
+    <w:lsdException w:name="Subtle Emphasis" w:uiPriority="19" w:qFormat="1"/>
+    <w:lsdException w:name="Intense Emphasis" w:uiPriority="21" w:qFormat="1"/>
+    <w:lsdException w:name="Subtle Reference" w:uiPriority="31" w:qFormat="1"/>
+    <w:lsdException w:name="Intense Reference" w:uiPriority="32" w:qFormat="1"/>
+    <w:lsdException w:name="Book Title" w:uiPriority="33" w:qFormat="1"/>
+    <w:lsdException w:name="Bibliography" w:semiHidden="1" w:uiPriority="37" w:unhideWhenUsed="1"/>
+    <w:lsdException w:name="TOC Heading" w:semiHidden="1" w:uiPriority="39" w:unhideWhenUsed="1" w:qFormat="1"/>
+    <w:lsdException w:name="Plain Table 1" w:uiPriority="41"/>
+    <w:lsdException w:name="Plain Table 2" w:uiPriority="42"/>
+    <w:lsdException w:name="Plain Table 3" w:uiPriority="43"/>
+    <w:lsdException w:name="Plain Table 4" w:uiPriority="44"/>
+    <w:lsdException w:name="Plain Table 5" w:uiPriority="45"/>
+    <w:lsdException w:name="Grid Table Light" w:uiPriority="40"/>
+    <w:lsdException w:name="Grid Table 1 Light" w:uiPriority="46"/>
+    <w:lsdException w:name="Grid Table 2" w:uiPriority="47"/>
+    <w:lsdException w:name="Grid Table 3" w:uiPriority="48"/>
+    <w:lsdException w:name="Grid Table 4" w:uiPriority="49"/>
+    <w:lsdException w:name="Grid Table 5 Dark" w:uiPriority="50"/>
+    <w:lsdException w:name="Grid Table 6 Colorful" w:uiPriority="51"/>
+    <w:lsdException w:name="Grid Table 7 Colorful" w:uiPriority="52"/>
+    <w:lsdException w:name="Grid Table 1 Light Accent 1" w:uiPriority="46"/>
+    <w:lsdException w:name="Grid Table 2 Accent 1" w:uiPriority="47"/>
+    <w:lsdException w:name="Grid Table 3 Accent 1" w:uiPriority="48"/>
+    <w:lsdException w:name="Grid Table 4 Accent 1" w:uiPriority="49"/>
+    <w:lsdException w:name="Grid Table 5 Dark Accent 1" w:uiPriority="50"/>
+    <w:lsdException w:name="Grid Table 6 Colorful Accent 1" w:uiPriority="51"/>
+    <w:lsdException w:name="Grid Table 7 Colorful Accent 1" w:uiPriority="52"/>
+    <w:lsdException w:name="Grid Table 1 Light Accent 2" w:uiPriority="46"/>
+    <w:lsdException w:name="Grid Table 2 Accent 2" w:uiPriority="47"/>
+    <w:lsdException w:name="Grid Table 3 Accent 2" w:uiPriority="48"/>
+    <w:lsdException w:name="Grid Table 4 Accent 2" w:uiPriority="49"/>
+    <w:lsdException w:name="Grid Table 5 Dark Accent 2" w:uiPriority="50"/>
+    <w:lsdException w:name="Grid Table 6 Colorful Accent 2" w:uiPriority="51"/>
+    <w:lsdException w:name="Grid Table 7 Colorful Accent 2" w:uiPriority="52"/>
+    <w:lsdException w:name="Grid Table 1 Light Accent 3" w:uiPriority="46"/>
+    <w:lsdException w:name="Grid Table 2 Accent 3" w:uiPriority="47"/>
+    <w:lsdException w:name="Grid Table 3 Accent 3" w:uiPriority="48"/>
+    <w:lsdException w:name="Grid Table 4 Accent 3" w:uiPriority="49"/>
+    <w:lsdException w:name="Grid Table 5 Dark Accent 3" w:uiPriority="50"/>
+    <w:lsdException w:name="Grid Table 6 Colorful Accent 3" w:uiPriority="51"/>
+    <w:lsdException w:name="Grid Table 7 Colorful Accent 3" w:uiPriority="52"/>
+    <w:lsdException w:name="Grid Table 1 Light Accent 4" w:uiPriority="46"/>
+    <w:lsdException w:name="Grid Table 2 Accent 4" w:uiPriority="47"/>
+    <w:lsdException w:name="Grid Table 3 Accent 4" w:uiPriority="48"/>
+    <w:lsdException w:name="Grid Table 4 Accent 4" w:uiPriority="49"/>
+    <w:lsdException w:name="Grid Table 5 Dark Accent 4" w:uiPriority="50"/>
+    <w:lsdException w:name="Grid Table 6 Colorful Accent 4" w:uiPriority="51"/>
+    <w:lsdException w:name="Grid Table 7 Colorful Accent 4" w:uiPriority="52"/>
+    <w:lsdException w:name="Grid Table 1 Light Accent 5" w:uiPriority="46"/>
+    <w:lsdException w:name="Grid Table 2 Accent 5" w:uiPriority="47"/>
+    <w:lsdException w:name="Grid Table 3 Accent 5" w:uiPriority="48"/>
+    <w:lsdException w:name="Grid Table 4 Accent 5" w:uiPriority="49"/>
+    <w:lsdException w:name="Grid Table 5 Dark Accent 5" w:uiPriority="50"/>
+    <w:lsdException w:name="Grid Table 6 Colorful Accent 5" w:uiPriority="51"/>
+    <w:lsdException w:name="Grid Table 7 Colorful Accent 5" w:uiPriority="52"/>
+    <w:lsdException w:name="Grid Table 1 Light Accent 6" w:uiPriority="46"/>
+    <w:lsdException w:name="Grid Table 2 Accent 6" w:uiPriority="47"/>
+    <w:lsdException w:name="Grid Table 3 Accent 6" w:uiPriority="48"/>
+    <w:lsdException w:name="Grid Table 4 Accent 6" w:uiPriority="49"/>
+    <w:lsdException w:name="Grid Table 5 Dark Accent 6" w:uiPriority="50"/>
+    <w:lsdException w:name="Grid Table 6 Colorful Accent 6" w:uiPriority="51"/>
+    <w:lsdException w:name="Grid Table 7 Colorful Accent 6" w:uiPriority="52"/>
+    <w:lsdException w:name="List Table 1 Light" w:uiPriority="46"/>
+    <w:lsdException w:name="List Table 2" w:uiPriority="47"/>
+    <w:lsdException w:name="List Table 3" w:uiPriority="48"/>
+    <w:lsdException w:name="List Table 4" w:uiPriority="49"/>
+    <w:lsdException w:name="List Table 5 Dark" w:uiPriority="50"/>
+    <w:lsdException w:name="List Table 6 Colorful" w:uiPriority="51"/>
+    <w:lsdException w:name="List Table 7 Colorful" w:uiPriority="52"/>
+    <w:lsdException w:name="List Table 1 Light Accent 1" w:uiPriority="46"/>
+    <w:lsdException w:name="List Table 2 Accent 1" w:uiPriority="47"/>
+    <w:lsdException w:name="List Table 3 Accent 1" w:uiPriority="48"/>
+    <w:lsdException w:name="List Table 4 Accent 1" w:uiPriority="49"/>
+    <w:lsdException w:name="List Table 5 Dark Accent 1" w:uiPriority="50"/>
+    <w:lsdException w:name="List Table 6 Colorful Accent 1" w:uiPriority="51"/>
+    <w:lsdException w:name="List Table 7 Colorful Accent 1" w:uiPriority="52"/>
+    <w:lsdException w:name="List Table 1 Light Accent 2" w:uiPriority="46"/>
+    <w:lsdException w:name="List Table 2 Accent 2" w:uiPriority="47"/>
+    <w:lsdException w:name="List Table 3 Accent 2" w:uiPriority="48"/>
+    <w:lsdException w:name="List Table 4 Accent 2" w:uiPriority="49"/>
+    <w:lsdException w:name="List Table 5 Dark Accent 2" w:uiPriority="50"/>
+    <w:lsdException w:name="List Table 6 Colorful Accent 2" w:uiPriority="51"/>
+    <w:lsdException w:name="List Table 7 Colorful Accent 2" w:uiPriority="52"/>
+    <w:lsdException w:name="List Table 1 Light Accent 3" w:uiPriority="46"/>
+    <w:lsdException w:name="List Table 2 Accent 3" w:uiPriority="47"/>
+    <w:lsdException w:name="List Table 3 Accent 3" w:uiPriority="48"/>
+    <w:lsdException w:name="List Table 4 Accent 3" w:uiPriority="49"/>
+    <w:lsdException w:name="List Table 5 Dark Accent 3" w:uiPriority="50"/>
+    <w:lsdException w:name="List Table 6 Colorful Accent 3" w:uiPriority="51"/>
+    <w:lsdException w:name="List Table 7 Colorful Accent 3" w:uiPriority="52"/>
+    <w:lsdException w:name="List Table 1 Light Accent 4" w:uiPriority="46"/>
+    <w:lsdException w:name="List Table 2 Accent 4" w:uiPriority="47"/>
+    <w:lsdException w:name="List Table 3 Accent 4" w:uiPriority="48"/>
+    <w:lsdException w:name="List Table 4 Accent 4" w:uiPriority="49"/>
+    <w:lsdException w:name="List Table 5 Dark Accent 4" w:uiPriority="50"/>
+    <w:lsdException w:name="List Table 6 Colorful Accent 4" w:uiPriority="51"/>
+    <w:lsdException w:name="List Table 7 Colorful Accent 4" w:uiPriority="52"/>
+    <w:lsdException w:name="List Table 1 Light Accent 5" w:uiPriority="46"/>
+    <w:lsdException w:name="List Table 2 Accent 5" w:uiPriority="47"/>
+    <w:lsdException w:name="List Table 3 Accent 5" w:uiPriority="48"/>
+    <w:lsdException w:name="List Table 4 Accent 5" w:uiPriority="49"/>
+    <w:lsdException w:name="List Table 5 Dark Accent 5" w:uiPriority="50"/>
+    <w:lsdException w:name="List Table 6 Colorful Accent 5" w:uiPriority="51"/>
+    <w:lsdException w:name="List Table 7 Colorful Accent 5" w:uiPriority="52"/>
+    <w:lsdException w:name="List Table 1 Light Accent 6" w:uiPriority="46"/>
+    <w:lsdException w:name="List Table 2 Accent 6" w:uiPriority="47"/>
+    <w:lsdException w:name="List Table 3 Accent 6" w:uiPriority="48"/>
+    <w:lsdException w:name="List Table 4 Accent 6" w:uiPriority="49"/>
+    <w:lsdException w:name="List Table 5 Dark Accent 6" w:uiPriority="50"/>
+    <w:lsdException w:name="List Table 6 Colorful Accent 6" w:uiPriority="51"/>
+    <w:lsdException w:name="List Table 7 Colorful Accent 6" w:uiPriority="52"/>
+    <w:lsdException w:name="Mention" w:semiHidden="1" w:unhideWhenUsed="1"/>
+    <w:lsdException w:name="Smart Hyperlink" w:semiHidden="1" w:unhideWhenUsed="1"/>
+    <w:lsdException w:name="Hashtag" w:semiHidden="1" w:unhideWhenUsed="1"/>
+    <w:lsdException w:name="Unresolved Mention" w:semiHidden="1" w:unhideWhenUsed="1"/>
+    <w:lsdException w:name="Smart Link" w:semiHidden="1" w:unhideWhenUsed="1"/>
   </w:latentStyles>
   <w:style w:type="paragraph" w:default="1" w:styleId="Normal">
     <w:name w:val="Normal"/>
@@ -2587,7 +4003,6 @@
     <w:uiPriority w:val="99"/>
     <w:semiHidden/>
     <w:unhideWhenUsed/>
-    <w:qFormat/>
     <w:tblPr>
       <w:tblInd w:w="0" w:type="dxa"/>
       <w:tblCellMar>
@@ -2693,7 +4108,7 @@
     <w:uiPriority w:val="39"/>
     <w:unhideWhenUsed/>
     <w:qFormat/>
-    <w:rsid w:val="0032361C"/>
+    <w:rsid w:val="0056126E"/>
     <w:pPr>
       <w:tabs>
         <w:tab w:val="right" w:leader="dot" w:pos="9360"/>
@@ -2705,6 +4120,7 @@
     <w:rPr>
       <w:b/>
       <w:noProof/>
+      <w:sz w:val="20"/>
     </w:rPr>
   </w:style>
   <w:style w:type="paragraph" w:styleId="TOC2">
@@ -2715,7 +4131,7 @@
     <w:uiPriority w:val="39"/>
     <w:unhideWhenUsed/>
     <w:qFormat/>
-    <w:rsid w:val="009323C7"/>
+    <w:rsid w:val="0056126E"/>
     <w:pPr>
       <w:tabs>
         <w:tab w:val="right" w:leader="dot" w:pos="9360"/>
@@ -2723,6 +4139,9 @@
       <w:spacing w:after="0"/>
       <w:ind w:left="1080"/>
     </w:pPr>
+    <w:rPr>
+      <w:sz w:val="20"/>
+    </w:rPr>
   </w:style>
   <w:style w:type="character" w:styleId="Hyperlink">
     <w:name w:val="Hyperlink"/>
@@ -2798,7 +4217,6 @@
     <w:uiPriority w:val="59"/>
     <w:rsid w:val="00085B87"/>
     <w:tblPr>
-      <w:tblInd w:w="0" w:type="dxa"/>
       <w:tblBorders>
         <w:top w:val="single" w:sz="4" w:space="0" w:color="000000" w:themeColor="text1"/>
         <w:left w:val="single" w:sz="4" w:space="0" w:color="000000" w:themeColor="text1"/>
@@ -2807,12 +4225,6 @@
         <w:insideH w:val="single" w:sz="4" w:space="0" w:color="000000" w:themeColor="text1"/>
         <w:insideV w:val="single" w:sz="4" w:space="0" w:color="000000" w:themeColor="text1"/>
       </w:tblBorders>
-      <w:tblCellMar>
-        <w:top w:w="0" w:type="dxa"/>
-        <w:left w:w="108" w:type="dxa"/>
-        <w:bottom w:w="0" w:type="dxa"/>
-        <w:right w:w="108" w:type="dxa"/>
-      </w:tblCellMar>
     </w:tblPr>
   </w:style>
   <w:style w:type="character" w:styleId="FollowedHyperlink">
@@ -3691,7 +5103,7 @@
 </file>
 
 <file path=customXml/itemProps1.xml><?xml version="1.0" encoding="utf-8"?>
-<ds:datastoreItem xmlns:ds="http://schemas.openxmlformats.org/officeDocument/2006/customXml" ds:itemID="{36D9A6F6-E029-4A32-ABAD-9BC43A46D07F}">
+<ds:datastoreItem xmlns:ds="http://schemas.openxmlformats.org/officeDocument/2006/customXml" ds:itemID="{717760C2-ED32-4329-8BDA-0959422AB60C}">
   <ds:schemaRefs>
     <ds:schemaRef ds:uri="http://schemas.openxmlformats.org/officeDocument/2006/bibliography"/>
   </ds:schemaRefs>

</xml_diff>